<commit_message>
Doc : Update Major, Menambahkan Vernon
</commit_message>
<xml_diff>
--- a/doc/Laporan Tubes STIMA RB - Gundam KW.docx
+++ b/doc/Laporan Tubes STIMA RB - Gundam KW.docx
@@ -7891,7 +7891,6 @@
           <w:szCs w:val="36"/>
         </w:rPr>
       </w:pPr>
-      <w:bookmarkStart w:id="6" w:name="_Toc230461024"/>
       <w:r>
         <w:rPr>
           <w:rFonts w:ascii="Garamond" w:hAnsi="Garamond" w:cstheme="majorBidi"/>
@@ -7900,45 +7899,75 @@
           <w:sz w:val="28"/>
           <w:szCs w:val="36"/>
         </w:rPr>
-        <w:t>NOMAD</w:t>
-      </w:r>
-      <w:bookmarkEnd w:id="6"/>
-    </w:p>
-    <w:p>
-      <w:pPr>
-        <w:pStyle w:val="Caption"/>
-        <w:ind w:left="360" w:right="529"/>
-        <w:jc w:val="both"/>
-        <w:rPr>
-          <w:sz w:val="24"/>
-          <w:szCs w:val="32"/>
-        </w:rPr>
-      </w:pPr>
-      <w:r>
-        <w:rPr>
-          <w:sz w:val="24"/>
-          <w:szCs w:val="32"/>
-        </w:rPr>
-        <w:t>Hal tersebut memperbolehkan</w:t>
-      </w:r>
-      <w:r>
-        <w:rPr>
-          <w:sz w:val="24"/>
-          <w:szCs w:val="32"/>
-        </w:rPr>
-        <w:t xml:space="preserve"> strategi yang bervariasi, dan memberi fleksibilitas untuk membuat bot yang lebih berfokus kepada keinginan imaginatif </w:t>
-      </w:r>
-      <w:proofErr w:type="spellStart"/>
-      <w:r>
-        <w:rPr>
-          <w:sz w:val="24"/>
-          <w:szCs w:val="32"/>
-        </w:rPr>
-        <w:t>masing</w:t>
-      </w:r>
-      <w:proofErr w:type="spellEnd"/>
-      <w:r>
-        <w:rPr>
+        <w:t>VERNON</w:t>
+      </w:r>
+    </w:p>
+    <w:p>
+      <w:pPr>
+        <w:ind w:left="360"/>
+        <w:rPr>
+          <w:spacing w:val="-5"/>
+          <w:sz w:val="24"/>
+          <w:szCs w:val="32"/>
+        </w:rPr>
+      </w:pPr>
+      <w:r>
+        <w:rPr>
+          <w:spacing w:val="-5"/>
+          <w:sz w:val="24"/>
+          <w:szCs w:val="32"/>
+        </w:rPr>
+        <w:t xml:space="preserve">Bot buatan Naufal. </w:t>
+      </w:r>
+      <w:proofErr w:type="spellStart"/>
+      <w:r>
+        <w:rPr>
+          <w:spacing w:val="-5"/>
+          <w:sz w:val="24"/>
+          <w:szCs w:val="32"/>
+        </w:rPr>
+        <w:t>Vernon</w:t>
+      </w:r>
+      <w:proofErr w:type="spellEnd"/>
+      <w:r>
+        <w:rPr>
+          <w:spacing w:val="-5"/>
+          <w:sz w:val="24"/>
+          <w:szCs w:val="32"/>
+        </w:rPr>
+        <w:t xml:space="preserve"> menerapkan strategi yang berfokus pada jarak. </w:t>
+      </w:r>
+      <w:proofErr w:type="spellStart"/>
+      <w:r>
+        <w:rPr>
+          <w:spacing w:val="-5"/>
+          <w:sz w:val="24"/>
+          <w:szCs w:val="32"/>
+        </w:rPr>
+        <w:t>Vernon</w:t>
+      </w:r>
+      <w:proofErr w:type="spellEnd"/>
+      <w:r>
+        <w:rPr>
+          <w:spacing w:val="-5"/>
+          <w:sz w:val="24"/>
+          <w:szCs w:val="32"/>
+        </w:rPr>
+        <w:t xml:space="preserve"> menggunakan pendekatan </w:t>
+      </w:r>
+      <w:proofErr w:type="spellStart"/>
+      <w:r>
+        <w:rPr>
+          <w:spacing w:val="-5"/>
+          <w:sz w:val="24"/>
+          <w:szCs w:val="32"/>
+        </w:rPr>
+        <w:t>greedy</w:t>
+      </w:r>
+      <w:proofErr w:type="spellEnd"/>
+      <w:r>
+        <w:rPr>
+          <w:spacing w:val="-5"/>
           <w:sz w:val="24"/>
           <w:szCs w:val="32"/>
         </w:rPr>
@@ -7947,24 +7976,272 @@
       <w:proofErr w:type="spellStart"/>
       <w:r>
         <w:rPr>
-          <w:sz w:val="24"/>
-          <w:szCs w:val="32"/>
-        </w:rPr>
-        <w:t>masing</w:t>
-      </w:r>
-      <w:proofErr w:type="spellEnd"/>
-      <w:r>
-        <w:rPr>
-          <w:sz w:val="24"/>
-          <w:szCs w:val="32"/>
-        </w:rPr>
-        <w:t xml:space="preserve"> anggota</w:t>
+          <w:spacing w:val="-5"/>
+          <w:sz w:val="24"/>
+          <w:szCs w:val="32"/>
+        </w:rPr>
+        <w:t>by</w:t>
+      </w:r>
+      <w:proofErr w:type="spellEnd"/>
+      <w:r>
+        <w:rPr>
+          <w:spacing w:val="-5"/>
+          <w:sz w:val="24"/>
+          <w:szCs w:val="32"/>
+        </w:rPr>
+        <w:t xml:space="preserve"> </w:t>
+      </w:r>
+      <w:proofErr w:type="spellStart"/>
+      <w:r>
+        <w:rPr>
+          <w:spacing w:val="-5"/>
+          <w:sz w:val="24"/>
+          <w:szCs w:val="32"/>
+        </w:rPr>
+        <w:t>positioning</w:t>
+      </w:r>
+      <w:proofErr w:type="spellEnd"/>
+      <w:r>
+        <w:rPr>
+          <w:spacing w:val="-5"/>
+          <w:sz w:val="24"/>
+          <w:szCs w:val="32"/>
+        </w:rPr>
+        <w:t xml:space="preserve">. Perilaku </w:t>
+      </w:r>
+      <w:proofErr w:type="spellStart"/>
+      <w:r>
+        <w:rPr>
+          <w:spacing w:val="-5"/>
+          <w:sz w:val="24"/>
+          <w:szCs w:val="32"/>
+        </w:rPr>
+        <w:t>Vernon</w:t>
+      </w:r>
+      <w:proofErr w:type="spellEnd"/>
+      <w:r>
+        <w:rPr>
+          <w:spacing w:val="-5"/>
+          <w:sz w:val="24"/>
+          <w:szCs w:val="32"/>
+        </w:rPr>
+        <w:t xml:space="preserve"> akan berubah-ubah sesuai  jaraknya.</w:t>
       </w:r>
     </w:p>
     <w:p>
       <w:pPr>
         <w:ind w:left="360"/>
-      </w:pPr>
+        <w:rPr>
+          <w:spacing w:val="-5"/>
+          <w:sz w:val="24"/>
+          <w:szCs w:val="32"/>
+        </w:rPr>
+      </w:pPr>
+    </w:p>
+    <w:p>
+      <w:pPr>
+        <w:ind w:left="360"/>
+        <w:rPr>
+          <w:spacing w:val="-5"/>
+          <w:sz w:val="24"/>
+          <w:szCs w:val="32"/>
+        </w:rPr>
+      </w:pPr>
+      <w:r>
+        <w:rPr>
+          <w:spacing w:val="-5"/>
+          <w:sz w:val="24"/>
+          <w:szCs w:val="32"/>
+        </w:rPr>
+        <w:t xml:space="preserve"> Untuk jarak jauh (&gt;250) maka bot ini akan berusaha mendekati lawan dengan bergerak relatif terhadap lawan yang </w:t>
+      </w:r>
+      <w:proofErr w:type="spellStart"/>
+      <w:r>
+        <w:rPr>
+          <w:spacing w:val="-5"/>
+          <w:sz w:val="24"/>
+          <w:szCs w:val="32"/>
+        </w:rPr>
+        <w:t>di-lock</w:t>
+      </w:r>
+      <w:proofErr w:type="spellEnd"/>
+      <w:r>
+        <w:rPr>
+          <w:spacing w:val="-5"/>
+          <w:sz w:val="24"/>
+          <w:szCs w:val="32"/>
+        </w:rPr>
+        <w:t xml:space="preserve">. Untuk jarak menengah (100-250), bot ini akan meniru </w:t>
+      </w:r>
+      <w:proofErr w:type="spellStart"/>
+      <w:r>
+        <w:rPr>
+          <w:spacing w:val="-5"/>
+          <w:sz w:val="24"/>
+          <w:szCs w:val="32"/>
+        </w:rPr>
+        <w:t>speed</w:t>
+      </w:r>
+      <w:proofErr w:type="spellEnd"/>
+      <w:r>
+        <w:rPr>
+          <w:spacing w:val="-5"/>
+          <w:sz w:val="24"/>
+          <w:szCs w:val="32"/>
+        </w:rPr>
+        <w:t xml:space="preserve"> dan arah gerak lawan. Dan untuk jarak (&lt;100), </w:t>
+      </w:r>
+      <w:proofErr w:type="spellStart"/>
+      <w:r>
+        <w:rPr>
+          <w:spacing w:val="-5"/>
+          <w:sz w:val="24"/>
+          <w:szCs w:val="32"/>
+        </w:rPr>
+        <w:t>Vernon</w:t>
+      </w:r>
+      <w:proofErr w:type="spellEnd"/>
+      <w:r>
+        <w:rPr>
+          <w:spacing w:val="-5"/>
+          <w:sz w:val="24"/>
+          <w:szCs w:val="32"/>
+        </w:rPr>
+        <w:t xml:space="preserve"> akan menabrakkan diri kepada lawannya.</w:t>
+      </w:r>
+    </w:p>
+    <w:p>
+      <w:pPr>
+        <w:ind w:left="360"/>
+        <w:rPr>
+          <w:spacing w:val="-5"/>
+          <w:sz w:val="24"/>
+          <w:szCs w:val="32"/>
+        </w:rPr>
+      </w:pPr>
+    </w:p>
+    <w:p>
+      <w:pPr>
+        <w:ind w:left="360"/>
+        <w:rPr>
+          <w:spacing w:val="-5"/>
+          <w:sz w:val="24"/>
+          <w:szCs w:val="32"/>
+        </w:rPr>
+      </w:pPr>
+      <w:proofErr w:type="spellStart"/>
+      <w:r>
+        <w:rPr>
+          <w:spacing w:val="-5"/>
+          <w:sz w:val="24"/>
+          <w:szCs w:val="32"/>
+        </w:rPr>
+        <w:t>Vernon</w:t>
+      </w:r>
+      <w:proofErr w:type="spellEnd"/>
+      <w:r>
+        <w:rPr>
+          <w:spacing w:val="-5"/>
+          <w:sz w:val="24"/>
+          <w:szCs w:val="32"/>
+        </w:rPr>
+        <w:t xml:space="preserve"> akan menyimpan energi saat berada pada jarak yang jauh dari lawan dengan hanya menembakkan peluru kekuatan rendah. Jika </w:t>
+      </w:r>
+      <w:proofErr w:type="spellStart"/>
+      <w:r>
+        <w:rPr>
+          <w:spacing w:val="-5"/>
+          <w:sz w:val="24"/>
+          <w:szCs w:val="32"/>
+        </w:rPr>
+        <w:t>Vernon</w:t>
+      </w:r>
+      <w:proofErr w:type="spellEnd"/>
+      <w:r>
+        <w:rPr>
+          <w:spacing w:val="-5"/>
+          <w:sz w:val="24"/>
+          <w:szCs w:val="32"/>
+        </w:rPr>
+        <w:t xml:space="preserve"> berada pada jarak yang dekat maka ia akan menembakkan peluru dengan kekuatan maksimal bersamaan dengan </w:t>
+      </w:r>
+      <w:proofErr w:type="spellStart"/>
+      <w:r>
+        <w:rPr>
+          <w:spacing w:val="-5"/>
+          <w:sz w:val="24"/>
+          <w:szCs w:val="32"/>
+        </w:rPr>
+        <w:t>speed</w:t>
+      </w:r>
+      <w:proofErr w:type="spellEnd"/>
+      <w:r>
+        <w:rPr>
+          <w:spacing w:val="-5"/>
+          <w:sz w:val="24"/>
+          <w:szCs w:val="32"/>
+        </w:rPr>
+        <w:t xml:space="preserve"> maksimal.</w:t>
+      </w:r>
+    </w:p>
+    <w:p>
+      <w:pPr>
+        <w:ind w:left="360"/>
+        <w:rPr>
+          <w:spacing w:val="-5"/>
+          <w:sz w:val="24"/>
+          <w:szCs w:val="32"/>
+        </w:rPr>
+      </w:pPr>
+    </w:p>
+    <w:p>
+      <w:pPr>
+        <w:ind w:left="360"/>
+      </w:pPr>
+      <w:r>
+        <w:rPr>
+          <w:spacing w:val="-5"/>
+          <w:sz w:val="24"/>
+          <w:szCs w:val="32"/>
+        </w:rPr>
+        <w:t xml:space="preserve">Jika </w:t>
+      </w:r>
+      <w:proofErr w:type="spellStart"/>
+      <w:r>
+        <w:rPr>
+          <w:spacing w:val="-5"/>
+          <w:sz w:val="24"/>
+          <w:szCs w:val="32"/>
+        </w:rPr>
+        <w:t>Vernon</w:t>
+      </w:r>
+      <w:proofErr w:type="spellEnd"/>
+      <w:r>
+        <w:rPr>
+          <w:spacing w:val="-5"/>
+          <w:sz w:val="24"/>
+          <w:szCs w:val="32"/>
+        </w:rPr>
+        <w:t xml:space="preserve"> menabrak dinding atau bot lainnya, ia akan langsung membalikkan arah dengan cara </w:t>
+      </w:r>
+      <w:proofErr w:type="spellStart"/>
+      <w:r>
+        <w:rPr>
+          <w:spacing w:val="-5"/>
+          <w:sz w:val="24"/>
+          <w:szCs w:val="32"/>
+        </w:rPr>
+        <w:t>moveDirection</w:t>
+      </w:r>
+      <w:proofErr w:type="spellEnd"/>
+      <w:r>
+        <w:rPr>
+          <w:spacing w:val="-5"/>
+          <w:sz w:val="24"/>
+          <w:szCs w:val="32"/>
+        </w:rPr>
+        <w:t xml:space="preserve"> *= -1 dengan waktu singkat.</w:t>
+      </w:r>
       <w:r>
         <w:br w:type="page"/>
       </w:r>
@@ -7977,7 +8254,7 @@
           <w:color w:val="auto"/>
         </w:rPr>
       </w:pPr>
-      <w:bookmarkStart w:id="7" w:name="_Toc230461025"/>
+      <w:bookmarkStart w:id="6" w:name="_Toc230461025"/>
       <w:r>
         <w:rPr>
           <w:color w:val="auto"/>
@@ -8003,7 +8280,7 @@
         </w:rPr>
         <w:t>Implementasi dan Pengujian</w:t>
       </w:r>
-      <w:bookmarkEnd w:id="7"/>
+      <w:bookmarkEnd w:id="6"/>
     </w:p>
     <w:p>
       <w:pPr>
@@ -23836,19 +24113,2440 @@
         <w:ind w:left="810" w:right="529"/>
         <w:jc w:val="center"/>
         <w:rPr>
+          <w:sz w:val="22"/>
+          <w:szCs w:val="28"/>
+          <w:lang w:val="en-US"/>
+        </w:rPr>
+      </w:pPr>
+      <w:r>
+        <w:rPr>
+          <w:sz w:val="22"/>
+          <w:szCs w:val="28"/>
+          <w:lang w:val="en-US"/>
+        </w:rPr>
+        <w:t>Exhibit A. Demo Bot Vs Match Up Advantage (Nomad, Gustav, Tinman)</w:t>
+      </w:r>
+    </w:p>
+    <w:p>
+      <w:pPr>
+        <w:rPr>
+          <w:b/>
+          <w:bCs/>
+          <w:color w:val="000000"/>
+          <w:sz w:val="28"/>
+          <w:szCs w:val="28"/>
+          <w:lang w:val="en-US"/>
+        </w:rPr>
+      </w:pPr>
+    </w:p>
+    <w:p>
+      <w:pPr>
+        <w:rPr>
+          <w:rFonts w:ascii="Times New Roman" w:hAnsi="Times New Roman"/>
+          <w:sz w:val="24"/>
+          <w:szCs w:val="24"/>
+          <w:lang w:val="en-US"/>
+        </w:rPr>
+      </w:pPr>
+      <w:r>
+        <w:rPr>
+          <w:b/>
+          <w:bCs/>
+          <w:color w:val="000000"/>
+          <w:sz w:val="28"/>
+          <w:szCs w:val="28"/>
+          <w:lang w:val="en-US"/>
+        </w:rPr>
+        <w:t>VERNON</w:t>
+      </w:r>
+      <w:r>
+        <w:rPr>
+          <w:color w:val="000000"/>
+          <w:sz w:val="24"/>
+          <w:szCs w:val="24"/>
+          <w:lang w:val="en-US"/>
+        </w:rPr>
+        <w:br/>
+      </w:r>
+      <w:proofErr w:type="spellStart"/>
+      <w:r>
+        <w:rPr>
+          <w:color w:val="000000"/>
+          <w:sz w:val="24"/>
+          <w:szCs w:val="24"/>
+          <w:lang w:val="en-US"/>
+        </w:rPr>
+        <w:t>Vernon</w:t>
+      </w:r>
+      <w:proofErr w:type="spellEnd"/>
+      <w:r>
+        <w:rPr>
+          <w:color w:val="000000"/>
+          <w:sz w:val="24"/>
+          <w:szCs w:val="24"/>
+          <w:lang w:val="en-US"/>
+        </w:rPr>
+        <w:t xml:space="preserve"> </w:t>
+      </w:r>
+      <w:proofErr w:type="spellStart"/>
+      <w:r>
+        <w:rPr>
+          <w:color w:val="000000"/>
+          <w:sz w:val="24"/>
+          <w:szCs w:val="24"/>
+          <w:lang w:val="en-US"/>
+        </w:rPr>
+        <w:t>memiliki</w:t>
+      </w:r>
+      <w:proofErr w:type="spellEnd"/>
+      <w:r>
+        <w:rPr>
+          <w:color w:val="000000"/>
+          <w:sz w:val="24"/>
+          <w:szCs w:val="24"/>
+          <w:lang w:val="en-US"/>
+        </w:rPr>
+        <w:t xml:space="preserve"> 3 kode </w:t>
+      </w:r>
+      <w:proofErr w:type="spellStart"/>
+      <w:r>
+        <w:rPr>
+          <w:color w:val="000000"/>
+          <w:sz w:val="24"/>
+          <w:szCs w:val="24"/>
+          <w:lang w:val="en-US"/>
+        </w:rPr>
+        <w:t>unik</w:t>
+      </w:r>
+      <w:proofErr w:type="spellEnd"/>
+      <w:r>
+        <w:rPr>
+          <w:color w:val="000000"/>
+          <w:sz w:val="24"/>
+          <w:szCs w:val="24"/>
+          <w:lang w:val="en-US"/>
+        </w:rPr>
+        <w:t xml:space="preserve"> di </w:t>
+      </w:r>
+      <w:proofErr w:type="spellStart"/>
+      <w:r>
+        <w:rPr>
+          <w:color w:val="000000"/>
+          <w:sz w:val="24"/>
+          <w:szCs w:val="24"/>
+          <w:lang w:val="en-US"/>
+        </w:rPr>
+        <w:t>dalamnya</w:t>
+      </w:r>
+      <w:proofErr w:type="spellEnd"/>
+      <w:r>
+        <w:rPr>
+          <w:color w:val="000000"/>
+          <w:sz w:val="24"/>
+          <w:szCs w:val="24"/>
+          <w:lang w:val="en-US"/>
+        </w:rPr>
+        <w:t>. Distance-Based Greedy Decision, Radar Lock &amp; Micro Sweep, dan Anti-Jam system.</w:t>
+      </w:r>
+    </w:p>
+    <w:p>
+      <w:pPr>
+        <w:spacing w:after="240"/>
+        <w:rPr>
+          <w:rFonts w:ascii="Times New Roman" w:hAnsi="Times New Roman"/>
+          <w:sz w:val="24"/>
+          <w:szCs w:val="24"/>
+          <w:lang w:val="en-US"/>
+        </w:rPr>
+      </w:pPr>
+    </w:p>
+    <w:p>
+      <w:pPr>
+        <w:rPr>
+          <w:rFonts w:ascii="Times New Roman" w:hAnsi="Times New Roman"/>
+          <w:sz w:val="24"/>
+          <w:szCs w:val="24"/>
+          <w:lang w:val="en-US"/>
+        </w:rPr>
+      </w:pPr>
+      <w:r>
+        <w:rPr>
+          <w:b/>
+          <w:bCs/>
+          <w:color w:val="000000"/>
+          <w:sz w:val="24"/>
+          <w:szCs w:val="24"/>
+          <w:lang w:val="en-US"/>
+        </w:rPr>
+        <w:t>DISTANCE-BASED GREEDY DECISION</w:t>
+      </w:r>
+    </w:p>
+    <w:p>
+      <w:pPr>
+        <w:shd w:val="clear" w:color="auto" w:fill="121314"/>
+        <w:rPr>
+          <w:rFonts w:ascii="Times New Roman" w:hAnsi="Times New Roman"/>
+          <w:sz w:val="24"/>
+          <w:szCs w:val="24"/>
+          <w:lang w:val="en-US"/>
+        </w:rPr>
+      </w:pPr>
+      <w:r>
+        <w:rPr>
+          <w:rFonts w:ascii="Consolas" w:hAnsi="Consolas"/>
+          <w:color w:val="F3F3F3"/>
+          <w:sz w:val="21"/>
+          <w:szCs w:val="21"/>
+          <w:lang w:val="en-US"/>
+        </w:rPr>
+        <w:t>if (</w:t>
+      </w:r>
+      <w:proofErr w:type="spellStart"/>
+      <w:r>
+        <w:rPr>
+          <w:rFonts w:ascii="Consolas" w:hAnsi="Consolas"/>
+          <w:color w:val="F3F3F3"/>
+          <w:sz w:val="21"/>
+          <w:szCs w:val="21"/>
+          <w:lang w:val="en-US"/>
+        </w:rPr>
+        <w:t>jarak</w:t>
+      </w:r>
+      <w:proofErr w:type="spellEnd"/>
+      <w:r>
+        <w:rPr>
+          <w:rFonts w:ascii="Consolas" w:hAnsi="Consolas"/>
+          <w:color w:val="F3F3F3"/>
+          <w:sz w:val="21"/>
+          <w:szCs w:val="21"/>
+          <w:lang w:val="en-US"/>
+        </w:rPr>
+        <w:t xml:space="preserve"> &lt;= </w:t>
+      </w:r>
+      <w:proofErr w:type="gramStart"/>
+      <w:r>
+        <w:rPr>
+          <w:rFonts w:ascii="Consolas" w:hAnsi="Consolas"/>
+          <w:color w:val="F3F3F3"/>
+          <w:sz w:val="21"/>
+          <w:szCs w:val="21"/>
+          <w:lang w:val="en-US"/>
+        </w:rPr>
+        <w:t>200){</w:t>
+      </w:r>
+      <w:proofErr w:type="gramEnd"/>
+      <w:r>
+        <w:rPr>
+          <w:rFonts w:ascii="Consolas" w:hAnsi="Consolas"/>
+          <w:color w:val="F3F3F3"/>
+          <w:sz w:val="21"/>
+          <w:szCs w:val="21"/>
+          <w:lang w:val="en-US"/>
+        </w:rPr>
+        <w:t>  </w:t>
+      </w:r>
+    </w:p>
+    <w:p>
+      <w:pPr>
+        <w:shd w:val="clear" w:color="auto" w:fill="121314"/>
+        <w:rPr>
+          <w:rFonts w:ascii="Times New Roman" w:hAnsi="Times New Roman"/>
+          <w:sz w:val="24"/>
+          <w:szCs w:val="24"/>
+          <w:lang w:val="en-US"/>
+        </w:rPr>
+      </w:pPr>
+      <w:r>
+        <w:rPr>
+          <w:rFonts w:ascii="Consolas" w:hAnsi="Consolas"/>
+          <w:color w:val="F3F3F3"/>
+          <w:sz w:val="21"/>
+          <w:szCs w:val="21"/>
+          <w:lang w:val="en-US"/>
+        </w:rPr>
+        <w:t>   </w:t>
+      </w:r>
+      <w:proofErr w:type="spellStart"/>
+      <w:proofErr w:type="gramStart"/>
+      <w:r>
+        <w:rPr>
+          <w:rFonts w:ascii="Consolas" w:hAnsi="Consolas"/>
+          <w:color w:val="F3F3F3"/>
+          <w:sz w:val="21"/>
+          <w:szCs w:val="21"/>
+          <w:lang w:val="en-US"/>
+        </w:rPr>
+        <w:t>SetTurnRight</w:t>
+      </w:r>
+      <w:proofErr w:type="spellEnd"/>
+      <w:r>
+        <w:rPr>
+          <w:rFonts w:ascii="Consolas" w:hAnsi="Consolas"/>
+          <w:color w:val="F3F3F3"/>
+          <w:sz w:val="21"/>
+          <w:szCs w:val="21"/>
+          <w:lang w:val="en-US"/>
+        </w:rPr>
+        <w:t>(</w:t>
+      </w:r>
+      <w:proofErr w:type="spellStart"/>
+      <w:proofErr w:type="gramEnd"/>
+      <w:r>
+        <w:rPr>
+          <w:rFonts w:ascii="Consolas" w:hAnsi="Consolas"/>
+          <w:color w:val="F3F3F3"/>
+          <w:sz w:val="21"/>
+          <w:szCs w:val="21"/>
+          <w:lang w:val="en-US"/>
+        </w:rPr>
+        <w:t>bearingFromBot</w:t>
+      </w:r>
+      <w:proofErr w:type="spellEnd"/>
+      <w:r>
+        <w:rPr>
+          <w:rFonts w:ascii="Consolas" w:hAnsi="Consolas"/>
+          <w:color w:val="F3F3F3"/>
+          <w:sz w:val="21"/>
+          <w:szCs w:val="21"/>
+          <w:lang w:val="en-US"/>
+        </w:rPr>
+        <w:t xml:space="preserve"> + 200);</w:t>
+      </w:r>
+    </w:p>
+    <w:p>
+      <w:pPr>
+        <w:shd w:val="clear" w:color="auto" w:fill="121314"/>
+        <w:rPr>
+          <w:rFonts w:ascii="Times New Roman" w:hAnsi="Times New Roman"/>
+          <w:sz w:val="24"/>
+          <w:szCs w:val="24"/>
+          <w:lang w:val="en-US"/>
+        </w:rPr>
+      </w:pPr>
+      <w:r>
+        <w:rPr>
+          <w:rFonts w:ascii="Consolas" w:hAnsi="Consolas"/>
+          <w:color w:val="F3F3F3"/>
+          <w:sz w:val="21"/>
+          <w:szCs w:val="21"/>
+          <w:lang w:val="en-US"/>
+        </w:rPr>
+        <w:t>   </w:t>
+      </w:r>
+      <w:proofErr w:type="spellStart"/>
+      <w:proofErr w:type="gramStart"/>
+      <w:r>
+        <w:rPr>
+          <w:rFonts w:ascii="Consolas" w:hAnsi="Consolas"/>
+          <w:color w:val="F3F3F3"/>
+          <w:sz w:val="21"/>
+          <w:szCs w:val="21"/>
+          <w:lang w:val="en-US"/>
+        </w:rPr>
+        <w:t>SetForward</w:t>
+      </w:r>
+      <w:proofErr w:type="spellEnd"/>
+      <w:r>
+        <w:rPr>
+          <w:rFonts w:ascii="Consolas" w:hAnsi="Consolas"/>
+          <w:color w:val="F3F3F3"/>
+          <w:sz w:val="21"/>
+          <w:szCs w:val="21"/>
+          <w:lang w:val="en-US"/>
+        </w:rPr>
+        <w:t>(</w:t>
+      </w:r>
+      <w:proofErr w:type="gramEnd"/>
+      <w:r>
+        <w:rPr>
+          <w:rFonts w:ascii="Consolas" w:hAnsi="Consolas"/>
+          <w:color w:val="F3F3F3"/>
+          <w:sz w:val="21"/>
+          <w:szCs w:val="21"/>
+          <w:lang w:val="en-US"/>
+        </w:rPr>
+        <w:t xml:space="preserve">150 * </w:t>
+      </w:r>
+      <w:proofErr w:type="spellStart"/>
+      <w:r>
+        <w:rPr>
+          <w:rFonts w:ascii="Consolas" w:hAnsi="Consolas"/>
+          <w:color w:val="F3F3F3"/>
+          <w:sz w:val="21"/>
+          <w:szCs w:val="21"/>
+          <w:lang w:val="en-US"/>
+        </w:rPr>
+        <w:t>moveDirection</w:t>
+      </w:r>
+      <w:proofErr w:type="spellEnd"/>
+      <w:r>
+        <w:rPr>
+          <w:rFonts w:ascii="Consolas" w:hAnsi="Consolas"/>
+          <w:color w:val="F3F3F3"/>
+          <w:sz w:val="21"/>
+          <w:szCs w:val="21"/>
+          <w:lang w:val="en-US"/>
+        </w:rPr>
+        <w:t>);</w:t>
+      </w:r>
+    </w:p>
+    <w:p>
+      <w:pPr>
+        <w:shd w:val="clear" w:color="auto" w:fill="121314"/>
+        <w:rPr>
+          <w:rFonts w:ascii="Times New Roman" w:hAnsi="Times New Roman"/>
+          <w:sz w:val="24"/>
+          <w:szCs w:val="24"/>
+          <w:lang w:val="en-US"/>
+        </w:rPr>
+      </w:pPr>
+      <w:r>
+        <w:rPr>
+          <w:rFonts w:ascii="Consolas" w:hAnsi="Consolas"/>
+          <w:color w:val="F3F3F3"/>
+          <w:sz w:val="21"/>
+          <w:szCs w:val="21"/>
+          <w:lang w:val="en-US"/>
+        </w:rPr>
+        <w:t>   } else if (</w:t>
+      </w:r>
+      <w:proofErr w:type="spellStart"/>
+      <w:r>
+        <w:rPr>
+          <w:rFonts w:ascii="Consolas" w:hAnsi="Consolas"/>
+          <w:color w:val="F3F3F3"/>
+          <w:sz w:val="21"/>
+          <w:szCs w:val="21"/>
+          <w:lang w:val="en-US"/>
+        </w:rPr>
+        <w:t>jarak</w:t>
+      </w:r>
+      <w:proofErr w:type="spellEnd"/>
+      <w:r>
+        <w:rPr>
+          <w:rFonts w:ascii="Consolas" w:hAnsi="Consolas"/>
+          <w:color w:val="F3F3F3"/>
+          <w:sz w:val="21"/>
+          <w:szCs w:val="21"/>
+          <w:lang w:val="en-US"/>
+        </w:rPr>
+        <w:t xml:space="preserve"> &gt; </w:t>
+      </w:r>
+      <w:proofErr w:type="gramStart"/>
+      <w:r>
+        <w:rPr>
+          <w:rFonts w:ascii="Consolas" w:hAnsi="Consolas"/>
+          <w:color w:val="F3F3F3"/>
+          <w:sz w:val="21"/>
+          <w:szCs w:val="21"/>
+          <w:lang w:val="en-US"/>
+        </w:rPr>
+        <w:t>170) {</w:t>
+      </w:r>
+      <w:proofErr w:type="gramEnd"/>
+    </w:p>
+    <w:p>
+      <w:pPr>
+        <w:shd w:val="clear" w:color="auto" w:fill="121314"/>
+        <w:rPr>
+          <w:rFonts w:ascii="Times New Roman" w:hAnsi="Times New Roman"/>
+          <w:sz w:val="24"/>
+          <w:szCs w:val="24"/>
+          <w:lang w:val="en-US"/>
+        </w:rPr>
+      </w:pPr>
+      <w:r>
+        <w:rPr>
+          <w:rFonts w:ascii="Consolas" w:hAnsi="Consolas"/>
+          <w:color w:val="F3F3F3"/>
+          <w:sz w:val="21"/>
+          <w:szCs w:val="21"/>
+          <w:lang w:val="en-US"/>
+        </w:rPr>
+        <w:t>   </w:t>
+      </w:r>
+      <w:proofErr w:type="spellStart"/>
+      <w:proofErr w:type="gramStart"/>
+      <w:r>
+        <w:rPr>
+          <w:rFonts w:ascii="Consolas" w:hAnsi="Consolas"/>
+          <w:color w:val="F3F3F3"/>
+          <w:sz w:val="21"/>
+          <w:szCs w:val="21"/>
+          <w:lang w:val="en-US"/>
+        </w:rPr>
+        <w:t>SetTurnRight</w:t>
+      </w:r>
+      <w:proofErr w:type="spellEnd"/>
+      <w:r>
+        <w:rPr>
+          <w:rFonts w:ascii="Consolas" w:hAnsi="Consolas"/>
+          <w:color w:val="F3F3F3"/>
+          <w:sz w:val="21"/>
+          <w:szCs w:val="21"/>
+          <w:lang w:val="en-US"/>
+        </w:rPr>
+        <w:t>(</w:t>
+      </w:r>
+      <w:proofErr w:type="spellStart"/>
+      <w:proofErr w:type="gramEnd"/>
+      <w:r>
+        <w:rPr>
+          <w:rFonts w:ascii="Consolas" w:hAnsi="Consolas"/>
+          <w:color w:val="F3F3F3"/>
+          <w:sz w:val="21"/>
+          <w:szCs w:val="21"/>
+          <w:lang w:val="en-US"/>
+        </w:rPr>
+        <w:t>bearingFromBot</w:t>
+      </w:r>
+      <w:proofErr w:type="spellEnd"/>
+      <w:r>
+        <w:rPr>
+          <w:rFonts w:ascii="Consolas" w:hAnsi="Consolas"/>
+          <w:color w:val="F3F3F3"/>
+          <w:sz w:val="21"/>
+          <w:szCs w:val="21"/>
+          <w:lang w:val="en-US"/>
+        </w:rPr>
+        <w:t xml:space="preserve"> + 60);</w:t>
+      </w:r>
+    </w:p>
+    <w:p>
+      <w:pPr>
+        <w:shd w:val="clear" w:color="auto" w:fill="121314"/>
+        <w:rPr>
+          <w:rFonts w:ascii="Times New Roman" w:hAnsi="Times New Roman"/>
+          <w:sz w:val="24"/>
+          <w:szCs w:val="24"/>
+          <w:lang w:val="en-US"/>
+        </w:rPr>
+      </w:pPr>
+      <w:r>
+        <w:rPr>
+          <w:rFonts w:ascii="Consolas" w:hAnsi="Consolas"/>
+          <w:color w:val="F3F3F3"/>
+          <w:sz w:val="21"/>
+          <w:szCs w:val="21"/>
+          <w:lang w:val="en-US"/>
+        </w:rPr>
+        <w:t>   </w:t>
+      </w:r>
+      <w:proofErr w:type="spellStart"/>
+      <w:proofErr w:type="gramStart"/>
+      <w:r>
+        <w:rPr>
+          <w:rFonts w:ascii="Consolas" w:hAnsi="Consolas"/>
+          <w:color w:val="F3F3F3"/>
+          <w:sz w:val="21"/>
+          <w:szCs w:val="21"/>
+          <w:lang w:val="en-US"/>
+        </w:rPr>
+        <w:t>SetForward</w:t>
+      </w:r>
+      <w:proofErr w:type="spellEnd"/>
+      <w:r>
+        <w:rPr>
+          <w:rFonts w:ascii="Consolas" w:hAnsi="Consolas"/>
+          <w:color w:val="F3F3F3"/>
+          <w:sz w:val="21"/>
+          <w:szCs w:val="21"/>
+          <w:lang w:val="en-US"/>
+        </w:rPr>
+        <w:t>(</w:t>
+      </w:r>
+      <w:proofErr w:type="gramEnd"/>
+      <w:r>
+        <w:rPr>
+          <w:rFonts w:ascii="Consolas" w:hAnsi="Consolas"/>
+          <w:color w:val="F3F3F3"/>
+          <w:sz w:val="21"/>
+          <w:szCs w:val="21"/>
+          <w:lang w:val="en-US"/>
+        </w:rPr>
+        <w:t xml:space="preserve">120 * </w:t>
+      </w:r>
+      <w:proofErr w:type="spellStart"/>
+      <w:r>
+        <w:rPr>
+          <w:rFonts w:ascii="Consolas" w:hAnsi="Consolas"/>
+          <w:color w:val="F3F3F3"/>
+          <w:sz w:val="21"/>
+          <w:szCs w:val="21"/>
+          <w:lang w:val="en-US"/>
+        </w:rPr>
+        <w:t>moveDirection</w:t>
+      </w:r>
+      <w:proofErr w:type="spellEnd"/>
+      <w:r>
+        <w:rPr>
+          <w:rFonts w:ascii="Consolas" w:hAnsi="Consolas"/>
+          <w:color w:val="F3F3F3"/>
+          <w:sz w:val="21"/>
+          <w:szCs w:val="21"/>
+          <w:lang w:val="en-US"/>
+        </w:rPr>
+        <w:t>);</w:t>
+      </w:r>
+    </w:p>
+    <w:p>
+      <w:pPr>
+        <w:shd w:val="clear" w:color="auto" w:fill="121314"/>
+        <w:rPr>
+          <w:rFonts w:ascii="Times New Roman" w:hAnsi="Times New Roman"/>
+          <w:sz w:val="24"/>
+          <w:szCs w:val="24"/>
+          <w:lang w:val="en-US"/>
+        </w:rPr>
+      </w:pPr>
+      <w:r>
+        <w:rPr>
+          <w:rFonts w:ascii="Consolas" w:hAnsi="Consolas"/>
+          <w:color w:val="F3F3F3"/>
+          <w:sz w:val="21"/>
+          <w:szCs w:val="21"/>
+          <w:lang w:val="en-US"/>
+        </w:rPr>
+        <w:lastRenderedPageBreak/>
+        <w:t>   } else if (</w:t>
+      </w:r>
+      <w:proofErr w:type="spellStart"/>
+      <w:r>
+        <w:rPr>
+          <w:rFonts w:ascii="Consolas" w:hAnsi="Consolas"/>
+          <w:color w:val="F3F3F3"/>
+          <w:sz w:val="21"/>
+          <w:szCs w:val="21"/>
+          <w:lang w:val="en-US"/>
+        </w:rPr>
+        <w:t>jarak</w:t>
+      </w:r>
+      <w:proofErr w:type="spellEnd"/>
+      <w:r>
+        <w:rPr>
+          <w:rFonts w:ascii="Consolas" w:hAnsi="Consolas"/>
+          <w:color w:val="F3F3F3"/>
+          <w:sz w:val="21"/>
+          <w:szCs w:val="21"/>
+          <w:lang w:val="en-US"/>
+        </w:rPr>
+        <w:t xml:space="preserve"> &gt; </w:t>
+      </w:r>
+      <w:proofErr w:type="gramStart"/>
+      <w:r>
+        <w:rPr>
+          <w:rFonts w:ascii="Consolas" w:hAnsi="Consolas"/>
+          <w:color w:val="F3F3F3"/>
+          <w:sz w:val="21"/>
+          <w:szCs w:val="21"/>
+          <w:lang w:val="en-US"/>
+        </w:rPr>
+        <w:t>150) {</w:t>
+      </w:r>
+      <w:proofErr w:type="gramEnd"/>
+    </w:p>
+    <w:p>
+      <w:pPr>
+        <w:shd w:val="clear" w:color="auto" w:fill="121314"/>
+        <w:rPr>
+          <w:rFonts w:ascii="Times New Roman" w:hAnsi="Times New Roman"/>
+          <w:sz w:val="24"/>
+          <w:szCs w:val="24"/>
+          <w:lang w:val="en-US"/>
+        </w:rPr>
+      </w:pPr>
+      <w:r>
+        <w:rPr>
+          <w:rFonts w:ascii="Consolas" w:hAnsi="Consolas"/>
+          <w:color w:val="F3F3F3"/>
+          <w:sz w:val="21"/>
+          <w:szCs w:val="21"/>
+          <w:lang w:val="en-US"/>
+        </w:rPr>
+        <w:t>   </w:t>
+      </w:r>
+      <w:proofErr w:type="spellStart"/>
+      <w:proofErr w:type="gramStart"/>
+      <w:r>
+        <w:rPr>
+          <w:rFonts w:ascii="Consolas" w:hAnsi="Consolas"/>
+          <w:color w:val="F3F3F3"/>
+          <w:sz w:val="21"/>
+          <w:szCs w:val="21"/>
+          <w:lang w:val="en-US"/>
+        </w:rPr>
+        <w:t>SetTurnRight</w:t>
+      </w:r>
+      <w:proofErr w:type="spellEnd"/>
+      <w:r>
+        <w:rPr>
+          <w:rFonts w:ascii="Consolas" w:hAnsi="Consolas"/>
+          <w:color w:val="F3F3F3"/>
+          <w:sz w:val="21"/>
+          <w:szCs w:val="21"/>
+          <w:lang w:val="en-US"/>
+        </w:rPr>
+        <w:t>(</w:t>
+      </w:r>
+      <w:proofErr w:type="spellStart"/>
+      <w:proofErr w:type="gramEnd"/>
+      <w:r>
+        <w:rPr>
+          <w:rFonts w:ascii="Consolas" w:hAnsi="Consolas"/>
+          <w:color w:val="F3F3F3"/>
+          <w:sz w:val="21"/>
+          <w:szCs w:val="21"/>
+          <w:lang w:val="en-US"/>
+        </w:rPr>
+        <w:t>bearingFromBot</w:t>
+      </w:r>
+      <w:proofErr w:type="spellEnd"/>
+      <w:r>
+        <w:rPr>
+          <w:rFonts w:ascii="Consolas" w:hAnsi="Consolas"/>
+          <w:color w:val="F3F3F3"/>
+          <w:sz w:val="21"/>
+          <w:szCs w:val="21"/>
+          <w:lang w:val="en-US"/>
+        </w:rPr>
+        <w:t xml:space="preserve"> + 120);</w:t>
+      </w:r>
+    </w:p>
+    <w:p>
+      <w:pPr>
+        <w:shd w:val="clear" w:color="auto" w:fill="121314"/>
+        <w:rPr>
+          <w:rFonts w:ascii="Times New Roman" w:hAnsi="Times New Roman"/>
+          <w:sz w:val="24"/>
+          <w:szCs w:val="24"/>
+          <w:lang w:val="en-US"/>
+        </w:rPr>
+      </w:pPr>
+      <w:r>
+        <w:rPr>
+          <w:rFonts w:ascii="Consolas" w:hAnsi="Consolas"/>
+          <w:color w:val="F3F3F3"/>
+          <w:sz w:val="21"/>
+          <w:szCs w:val="21"/>
+          <w:lang w:val="en-US"/>
+        </w:rPr>
+        <w:t>   </w:t>
+      </w:r>
+      <w:proofErr w:type="spellStart"/>
+      <w:proofErr w:type="gramStart"/>
+      <w:r>
+        <w:rPr>
+          <w:rFonts w:ascii="Consolas" w:hAnsi="Consolas"/>
+          <w:color w:val="F3F3F3"/>
+          <w:sz w:val="21"/>
+          <w:szCs w:val="21"/>
+          <w:lang w:val="en-US"/>
+        </w:rPr>
+        <w:t>SetForward</w:t>
+      </w:r>
+      <w:proofErr w:type="spellEnd"/>
+      <w:r>
+        <w:rPr>
+          <w:rFonts w:ascii="Consolas" w:hAnsi="Consolas"/>
+          <w:color w:val="F3F3F3"/>
+          <w:sz w:val="21"/>
+          <w:szCs w:val="21"/>
+          <w:lang w:val="en-US"/>
+        </w:rPr>
+        <w:t>(</w:t>
+      </w:r>
+      <w:proofErr w:type="gramEnd"/>
+      <w:r>
+        <w:rPr>
+          <w:rFonts w:ascii="Consolas" w:hAnsi="Consolas"/>
+          <w:color w:val="F3F3F3"/>
+          <w:sz w:val="21"/>
+          <w:szCs w:val="21"/>
+          <w:lang w:val="en-US"/>
+        </w:rPr>
+        <w:t xml:space="preserve">120 * </w:t>
+      </w:r>
+      <w:proofErr w:type="spellStart"/>
+      <w:r>
+        <w:rPr>
+          <w:rFonts w:ascii="Consolas" w:hAnsi="Consolas"/>
+          <w:color w:val="F3F3F3"/>
+          <w:sz w:val="21"/>
+          <w:szCs w:val="21"/>
+          <w:lang w:val="en-US"/>
+        </w:rPr>
+        <w:t>moveDirection</w:t>
+      </w:r>
+      <w:proofErr w:type="spellEnd"/>
+      <w:r>
+        <w:rPr>
+          <w:rFonts w:ascii="Consolas" w:hAnsi="Consolas"/>
+          <w:color w:val="F3F3F3"/>
+          <w:sz w:val="21"/>
+          <w:szCs w:val="21"/>
+          <w:lang w:val="en-US"/>
+        </w:rPr>
+        <w:t>);</w:t>
+      </w:r>
+    </w:p>
+    <w:p>
+      <w:pPr>
+        <w:shd w:val="clear" w:color="auto" w:fill="121314"/>
+        <w:rPr>
+          <w:rFonts w:ascii="Times New Roman" w:hAnsi="Times New Roman"/>
+          <w:sz w:val="24"/>
+          <w:szCs w:val="24"/>
+          <w:lang w:val="en-US"/>
+        </w:rPr>
+      </w:pPr>
+      <w:r>
+        <w:rPr>
+          <w:rFonts w:ascii="Consolas" w:hAnsi="Consolas"/>
+          <w:color w:val="F3F3F3"/>
+          <w:sz w:val="21"/>
+          <w:szCs w:val="21"/>
+          <w:lang w:val="en-US"/>
+        </w:rPr>
+        <w:t>    } else if (</w:t>
+      </w:r>
+      <w:proofErr w:type="spellStart"/>
+      <w:r>
+        <w:rPr>
+          <w:rFonts w:ascii="Consolas" w:hAnsi="Consolas"/>
+          <w:color w:val="F3F3F3"/>
+          <w:sz w:val="21"/>
+          <w:szCs w:val="21"/>
+          <w:lang w:val="en-US"/>
+        </w:rPr>
+        <w:t>jarak</w:t>
+      </w:r>
+      <w:proofErr w:type="spellEnd"/>
+      <w:r>
+        <w:rPr>
+          <w:rFonts w:ascii="Consolas" w:hAnsi="Consolas"/>
+          <w:color w:val="F3F3F3"/>
+          <w:sz w:val="21"/>
+          <w:szCs w:val="21"/>
+          <w:lang w:val="en-US"/>
+        </w:rPr>
+        <w:t xml:space="preserve"> &gt; </w:t>
+      </w:r>
+      <w:proofErr w:type="gramStart"/>
+      <w:r>
+        <w:rPr>
+          <w:rFonts w:ascii="Consolas" w:hAnsi="Consolas"/>
+          <w:color w:val="F3F3F3"/>
+          <w:sz w:val="21"/>
+          <w:szCs w:val="21"/>
+          <w:lang w:val="en-US"/>
+        </w:rPr>
+        <w:t>100) {</w:t>
+      </w:r>
+      <w:proofErr w:type="gramEnd"/>
+    </w:p>
+    <w:p>
+      <w:pPr>
+        <w:shd w:val="clear" w:color="auto" w:fill="121314"/>
+        <w:rPr>
+          <w:rFonts w:ascii="Times New Roman" w:hAnsi="Times New Roman"/>
+          <w:sz w:val="24"/>
+          <w:szCs w:val="24"/>
+          <w:lang w:val="en-US"/>
+        </w:rPr>
+      </w:pPr>
+      <w:r>
+        <w:rPr>
+          <w:rFonts w:ascii="Consolas" w:hAnsi="Consolas"/>
+          <w:color w:val="F3F3F3"/>
+          <w:sz w:val="21"/>
+          <w:szCs w:val="21"/>
+          <w:lang w:val="en-US"/>
+        </w:rPr>
+        <w:t xml:space="preserve">    double </w:t>
+      </w:r>
+      <w:proofErr w:type="spellStart"/>
+      <w:r>
+        <w:rPr>
+          <w:rFonts w:ascii="Consolas" w:hAnsi="Consolas"/>
+          <w:color w:val="F3F3F3"/>
+          <w:sz w:val="21"/>
+          <w:szCs w:val="21"/>
+          <w:lang w:val="en-US"/>
+        </w:rPr>
+        <w:t>matchingDirection</w:t>
+      </w:r>
+      <w:proofErr w:type="spellEnd"/>
+      <w:r>
+        <w:rPr>
+          <w:rFonts w:ascii="Consolas" w:hAnsi="Consolas"/>
+          <w:color w:val="F3F3F3"/>
+          <w:sz w:val="21"/>
+          <w:szCs w:val="21"/>
+          <w:lang w:val="en-US"/>
+        </w:rPr>
+        <w:t xml:space="preserve"> = </w:t>
+      </w:r>
+      <w:proofErr w:type="spellStart"/>
+      <w:proofErr w:type="gramStart"/>
+      <w:r>
+        <w:rPr>
+          <w:rFonts w:ascii="Consolas" w:hAnsi="Consolas"/>
+          <w:color w:val="F3F3F3"/>
+          <w:sz w:val="21"/>
+          <w:szCs w:val="21"/>
+          <w:lang w:val="en-US"/>
+        </w:rPr>
+        <w:t>NormalizeRelativeAngle</w:t>
+      </w:r>
+      <w:proofErr w:type="spellEnd"/>
+      <w:r>
+        <w:rPr>
+          <w:rFonts w:ascii="Consolas" w:hAnsi="Consolas"/>
+          <w:color w:val="F3F3F3"/>
+          <w:sz w:val="21"/>
+          <w:szCs w:val="21"/>
+          <w:lang w:val="en-US"/>
+        </w:rPr>
+        <w:t>(</w:t>
+      </w:r>
+      <w:proofErr w:type="spellStart"/>
+      <w:proofErr w:type="gramEnd"/>
+      <w:r>
+        <w:rPr>
+          <w:rFonts w:ascii="Consolas" w:hAnsi="Consolas"/>
+          <w:color w:val="F3F3F3"/>
+          <w:sz w:val="21"/>
+          <w:szCs w:val="21"/>
+          <w:lang w:val="en-US"/>
+        </w:rPr>
+        <w:t>targetDirection</w:t>
+      </w:r>
+      <w:proofErr w:type="spellEnd"/>
+      <w:r>
+        <w:rPr>
+          <w:rFonts w:ascii="Consolas" w:hAnsi="Consolas"/>
+          <w:color w:val="F3F3F3"/>
+          <w:sz w:val="21"/>
+          <w:szCs w:val="21"/>
+          <w:lang w:val="en-US"/>
+        </w:rPr>
+        <w:t xml:space="preserve"> - Direction);</w:t>
+      </w:r>
+    </w:p>
+    <w:p>
+      <w:pPr>
+        <w:shd w:val="clear" w:color="auto" w:fill="121314"/>
+        <w:rPr>
+          <w:rFonts w:ascii="Times New Roman" w:hAnsi="Times New Roman"/>
+          <w:sz w:val="24"/>
+          <w:szCs w:val="24"/>
+          <w:lang w:val="en-US"/>
+        </w:rPr>
+      </w:pPr>
+      <w:r>
+        <w:rPr>
+          <w:rFonts w:ascii="Consolas" w:hAnsi="Consolas"/>
+          <w:color w:val="F3F3F3"/>
+          <w:sz w:val="21"/>
+          <w:szCs w:val="21"/>
+          <w:lang w:val="en-US"/>
+        </w:rPr>
+        <w:t>        </w:t>
+      </w:r>
+      <w:proofErr w:type="spellStart"/>
+      <w:proofErr w:type="gramStart"/>
+      <w:r>
+        <w:rPr>
+          <w:rFonts w:ascii="Consolas" w:hAnsi="Consolas"/>
+          <w:color w:val="F3F3F3"/>
+          <w:sz w:val="21"/>
+          <w:szCs w:val="21"/>
+          <w:lang w:val="en-US"/>
+        </w:rPr>
+        <w:t>SetTurnRight</w:t>
+      </w:r>
+      <w:proofErr w:type="spellEnd"/>
+      <w:r>
+        <w:rPr>
+          <w:rFonts w:ascii="Consolas" w:hAnsi="Consolas"/>
+          <w:color w:val="F3F3F3"/>
+          <w:sz w:val="21"/>
+          <w:szCs w:val="21"/>
+          <w:lang w:val="en-US"/>
+        </w:rPr>
+        <w:t>(</w:t>
+      </w:r>
+      <w:proofErr w:type="spellStart"/>
+      <w:proofErr w:type="gramEnd"/>
+      <w:r>
+        <w:rPr>
+          <w:rFonts w:ascii="Consolas" w:hAnsi="Consolas"/>
+          <w:color w:val="F3F3F3"/>
+          <w:sz w:val="21"/>
+          <w:szCs w:val="21"/>
+          <w:lang w:val="en-US"/>
+        </w:rPr>
+        <w:t>matchingDirection</w:t>
+      </w:r>
+      <w:proofErr w:type="spellEnd"/>
+      <w:r>
+        <w:rPr>
+          <w:rFonts w:ascii="Consolas" w:hAnsi="Consolas"/>
+          <w:color w:val="F3F3F3"/>
+          <w:sz w:val="21"/>
+          <w:szCs w:val="21"/>
+          <w:lang w:val="en-US"/>
+        </w:rPr>
+        <w:t xml:space="preserve"> + 90);</w:t>
+      </w:r>
+    </w:p>
+    <w:p>
+      <w:pPr>
+        <w:shd w:val="clear" w:color="auto" w:fill="121314"/>
+        <w:rPr>
+          <w:rFonts w:ascii="Times New Roman" w:hAnsi="Times New Roman"/>
+          <w:sz w:val="24"/>
+          <w:szCs w:val="24"/>
+          <w:lang w:val="en-US"/>
+        </w:rPr>
+      </w:pPr>
+      <w:r>
+        <w:rPr>
+          <w:rFonts w:ascii="Consolas" w:hAnsi="Consolas"/>
+          <w:color w:val="F3F3F3"/>
+          <w:sz w:val="21"/>
+          <w:szCs w:val="21"/>
+          <w:lang w:val="en-US"/>
+        </w:rPr>
+        <w:t>        </w:t>
+      </w:r>
+      <w:proofErr w:type="spellStart"/>
+      <w:proofErr w:type="gramStart"/>
+      <w:r>
+        <w:rPr>
+          <w:rFonts w:ascii="Consolas" w:hAnsi="Consolas"/>
+          <w:color w:val="F3F3F3"/>
+          <w:sz w:val="21"/>
+          <w:szCs w:val="21"/>
+          <w:lang w:val="en-US"/>
+        </w:rPr>
+        <w:t>SetForward</w:t>
+      </w:r>
+      <w:proofErr w:type="spellEnd"/>
+      <w:r>
+        <w:rPr>
+          <w:rFonts w:ascii="Consolas" w:hAnsi="Consolas"/>
+          <w:color w:val="F3F3F3"/>
+          <w:sz w:val="21"/>
+          <w:szCs w:val="21"/>
+          <w:lang w:val="en-US"/>
+        </w:rPr>
+        <w:t>(</w:t>
+      </w:r>
+      <w:proofErr w:type="spellStart"/>
+      <w:proofErr w:type="gramEnd"/>
+      <w:r>
+        <w:rPr>
+          <w:rFonts w:ascii="Consolas" w:hAnsi="Consolas"/>
+          <w:color w:val="F3F3F3"/>
+          <w:sz w:val="21"/>
+          <w:szCs w:val="21"/>
+          <w:lang w:val="en-US"/>
+        </w:rPr>
+        <w:t>targetSpeed</w:t>
+      </w:r>
+      <w:proofErr w:type="spellEnd"/>
+      <w:r>
+        <w:rPr>
+          <w:rFonts w:ascii="Consolas" w:hAnsi="Consolas"/>
+          <w:color w:val="F3F3F3"/>
+          <w:sz w:val="21"/>
+          <w:szCs w:val="21"/>
+          <w:lang w:val="en-US"/>
+        </w:rPr>
+        <w:t xml:space="preserve"> + 5 * </w:t>
+      </w:r>
+      <w:proofErr w:type="spellStart"/>
+      <w:r>
+        <w:rPr>
+          <w:rFonts w:ascii="Consolas" w:hAnsi="Consolas"/>
+          <w:color w:val="F3F3F3"/>
+          <w:sz w:val="21"/>
+          <w:szCs w:val="21"/>
+          <w:lang w:val="en-US"/>
+        </w:rPr>
+        <w:t>moveDirection</w:t>
+      </w:r>
+      <w:proofErr w:type="spellEnd"/>
+      <w:r>
+        <w:rPr>
+          <w:rFonts w:ascii="Consolas" w:hAnsi="Consolas"/>
+          <w:color w:val="F3F3F3"/>
+          <w:sz w:val="21"/>
+          <w:szCs w:val="21"/>
+          <w:lang w:val="en-US"/>
+        </w:rPr>
+        <w:t>);</w:t>
+      </w:r>
+    </w:p>
+    <w:p>
+      <w:pPr>
+        <w:shd w:val="clear" w:color="auto" w:fill="121314"/>
+        <w:rPr>
+          <w:rFonts w:ascii="Times New Roman" w:hAnsi="Times New Roman"/>
+          <w:sz w:val="24"/>
+          <w:szCs w:val="24"/>
+          <w:lang w:val="en-US"/>
+        </w:rPr>
+      </w:pPr>
+      <w:r>
+        <w:rPr>
+          <w:rFonts w:ascii="Consolas" w:hAnsi="Consolas"/>
+          <w:color w:val="F3F3F3"/>
+          <w:sz w:val="21"/>
+          <w:szCs w:val="21"/>
+          <w:lang w:val="en-US"/>
+        </w:rPr>
+        <w:t>        } else {</w:t>
+      </w:r>
+    </w:p>
+    <w:p>
+      <w:pPr>
+        <w:shd w:val="clear" w:color="auto" w:fill="121314"/>
+        <w:rPr>
+          <w:rFonts w:ascii="Times New Roman" w:hAnsi="Times New Roman"/>
+          <w:sz w:val="24"/>
+          <w:szCs w:val="24"/>
+          <w:lang w:val="en-US"/>
+        </w:rPr>
+      </w:pPr>
+      <w:r>
+        <w:rPr>
+          <w:rFonts w:ascii="Consolas" w:hAnsi="Consolas"/>
+          <w:color w:val="F3F3F3"/>
+          <w:sz w:val="21"/>
+          <w:szCs w:val="21"/>
+          <w:lang w:val="en-US"/>
+        </w:rPr>
+        <w:t>          </w:t>
+      </w:r>
+      <w:proofErr w:type="spellStart"/>
+      <w:r>
+        <w:rPr>
+          <w:rFonts w:ascii="Consolas" w:hAnsi="Consolas"/>
+          <w:color w:val="F3F3F3"/>
+          <w:sz w:val="21"/>
+          <w:szCs w:val="21"/>
+          <w:lang w:val="en-US"/>
+        </w:rPr>
+        <w:t>SetTurnRight</w:t>
+      </w:r>
+      <w:proofErr w:type="spellEnd"/>
+      <w:r>
+        <w:rPr>
+          <w:rFonts w:ascii="Consolas" w:hAnsi="Consolas"/>
+          <w:color w:val="F3F3F3"/>
+          <w:sz w:val="21"/>
+          <w:szCs w:val="21"/>
+          <w:lang w:val="en-US"/>
+        </w:rPr>
+        <w:t>(</w:t>
+      </w:r>
+      <w:proofErr w:type="spellStart"/>
+      <w:r>
+        <w:rPr>
+          <w:rFonts w:ascii="Consolas" w:hAnsi="Consolas"/>
+          <w:color w:val="F3F3F3"/>
+          <w:sz w:val="21"/>
+          <w:szCs w:val="21"/>
+          <w:lang w:val="en-US"/>
+        </w:rPr>
+        <w:t>bearingFromBot</w:t>
+      </w:r>
+      <w:proofErr w:type="spellEnd"/>
+      <w:r>
+        <w:rPr>
+          <w:rFonts w:ascii="Consolas" w:hAnsi="Consolas"/>
+          <w:color w:val="F3F3F3"/>
+          <w:sz w:val="21"/>
+          <w:szCs w:val="21"/>
+          <w:lang w:val="en-US"/>
+        </w:rPr>
+        <w:t>);</w:t>
+      </w:r>
+    </w:p>
+    <w:p>
+      <w:pPr>
+        <w:shd w:val="clear" w:color="auto" w:fill="121314"/>
+        <w:rPr>
+          <w:rFonts w:ascii="Times New Roman" w:hAnsi="Times New Roman"/>
+          <w:sz w:val="24"/>
+          <w:szCs w:val="24"/>
+          <w:lang w:val="en-US"/>
+        </w:rPr>
+      </w:pPr>
+      <w:r>
+        <w:rPr>
+          <w:rFonts w:ascii="Consolas" w:hAnsi="Consolas"/>
+          <w:color w:val="F3F3F3"/>
+          <w:sz w:val="21"/>
+          <w:szCs w:val="21"/>
+          <w:lang w:val="en-US"/>
+        </w:rPr>
+        <w:t>          </w:t>
+      </w:r>
+      <w:proofErr w:type="spellStart"/>
+      <w:proofErr w:type="gramStart"/>
+      <w:r>
+        <w:rPr>
+          <w:rFonts w:ascii="Consolas" w:hAnsi="Consolas"/>
+          <w:color w:val="F3F3F3"/>
+          <w:sz w:val="21"/>
+          <w:szCs w:val="21"/>
+          <w:lang w:val="en-US"/>
+        </w:rPr>
+        <w:t>SetForward</w:t>
+      </w:r>
+      <w:proofErr w:type="spellEnd"/>
+      <w:r>
+        <w:rPr>
+          <w:rFonts w:ascii="Consolas" w:hAnsi="Consolas"/>
+          <w:color w:val="F3F3F3"/>
+          <w:sz w:val="21"/>
+          <w:szCs w:val="21"/>
+          <w:lang w:val="en-US"/>
+        </w:rPr>
+        <w:t>(</w:t>
+      </w:r>
+      <w:proofErr w:type="gramEnd"/>
+      <w:r>
+        <w:rPr>
+          <w:rFonts w:ascii="Consolas" w:hAnsi="Consolas"/>
+          <w:color w:val="F3F3F3"/>
+          <w:sz w:val="21"/>
+          <w:szCs w:val="21"/>
+          <w:lang w:val="en-US"/>
+        </w:rPr>
+        <w:t xml:space="preserve">300 * </w:t>
+      </w:r>
+      <w:proofErr w:type="spellStart"/>
+      <w:r>
+        <w:rPr>
+          <w:rFonts w:ascii="Consolas" w:hAnsi="Consolas"/>
+          <w:color w:val="F3F3F3"/>
+          <w:sz w:val="21"/>
+          <w:szCs w:val="21"/>
+          <w:lang w:val="en-US"/>
+        </w:rPr>
+        <w:t>moveDirection</w:t>
+      </w:r>
+      <w:proofErr w:type="spellEnd"/>
+      <w:r>
+        <w:rPr>
+          <w:rFonts w:ascii="Consolas" w:hAnsi="Consolas"/>
+          <w:color w:val="F3F3F3"/>
+          <w:sz w:val="21"/>
+          <w:szCs w:val="21"/>
+          <w:lang w:val="en-US"/>
+        </w:rPr>
+        <w:t>);</w:t>
+      </w:r>
+    </w:p>
+    <w:p>
+      <w:pPr>
+        <w:shd w:val="clear" w:color="auto" w:fill="121314"/>
+        <w:rPr>
+          <w:rFonts w:ascii="Times New Roman" w:hAnsi="Times New Roman"/>
+          <w:sz w:val="24"/>
+          <w:szCs w:val="24"/>
+          <w:lang w:val="en-US"/>
+        </w:rPr>
+      </w:pPr>
+      <w:r>
+        <w:rPr>
+          <w:rFonts w:ascii="Consolas" w:hAnsi="Consolas"/>
+          <w:color w:val="F3F3F3"/>
+          <w:sz w:val="21"/>
+          <w:szCs w:val="21"/>
+          <w:lang w:val="en-US"/>
+        </w:rPr>
+        <w:t> }</w:t>
+      </w:r>
+    </w:p>
+    <w:p>
+      <w:pPr>
+        <w:rPr>
+          <w:rFonts w:ascii="Times New Roman" w:hAnsi="Times New Roman"/>
+          <w:sz w:val="24"/>
+          <w:szCs w:val="24"/>
+          <w:lang w:val="en-US"/>
+        </w:rPr>
+      </w:pPr>
+    </w:p>
+    <w:p>
+      <w:pPr>
+        <w:rPr>
+          <w:rFonts w:ascii="Times New Roman" w:hAnsi="Times New Roman"/>
+          <w:sz w:val="24"/>
+          <w:szCs w:val="24"/>
+          <w:lang w:val="en-US"/>
+        </w:rPr>
+      </w:pPr>
+      <w:r>
+        <w:rPr>
+          <w:color w:val="000000"/>
+          <w:sz w:val="24"/>
+          <w:szCs w:val="24"/>
+          <w:lang w:val="en-US"/>
+        </w:rPr>
+        <w:t xml:space="preserve">Vernon </w:t>
+      </w:r>
+      <w:proofErr w:type="spellStart"/>
+      <w:r>
+        <w:rPr>
+          <w:color w:val="000000"/>
+          <w:sz w:val="24"/>
+          <w:szCs w:val="24"/>
+          <w:lang w:val="en-US"/>
+        </w:rPr>
+        <w:t>menentukan</w:t>
+      </w:r>
+      <w:proofErr w:type="spellEnd"/>
+      <w:r>
+        <w:rPr>
+          <w:color w:val="000000"/>
+          <w:sz w:val="24"/>
+          <w:szCs w:val="24"/>
+          <w:lang w:val="en-US"/>
+        </w:rPr>
+        <w:t xml:space="preserve"> </w:t>
+      </w:r>
+      <w:proofErr w:type="spellStart"/>
+      <w:r>
+        <w:rPr>
+          <w:color w:val="000000"/>
+          <w:sz w:val="24"/>
+          <w:szCs w:val="24"/>
+          <w:lang w:val="en-US"/>
+        </w:rPr>
+        <w:t>cara</w:t>
+      </w:r>
+      <w:proofErr w:type="spellEnd"/>
+      <w:r>
+        <w:rPr>
+          <w:color w:val="000000"/>
+          <w:sz w:val="24"/>
+          <w:szCs w:val="24"/>
+          <w:lang w:val="en-US"/>
+        </w:rPr>
+        <w:t xml:space="preserve"> </w:t>
+      </w:r>
+      <w:proofErr w:type="spellStart"/>
+      <w:r>
+        <w:rPr>
+          <w:color w:val="000000"/>
+          <w:sz w:val="24"/>
+          <w:szCs w:val="24"/>
+          <w:lang w:val="en-US"/>
+        </w:rPr>
+        <w:t>bergeraknya</w:t>
+      </w:r>
+      <w:proofErr w:type="spellEnd"/>
+      <w:r>
+        <w:rPr>
+          <w:color w:val="000000"/>
+          <w:sz w:val="24"/>
+          <w:szCs w:val="24"/>
+          <w:lang w:val="en-US"/>
+        </w:rPr>
+        <w:t xml:space="preserve"> </w:t>
+      </w:r>
+      <w:proofErr w:type="spellStart"/>
+      <w:r>
+        <w:rPr>
+          <w:color w:val="000000"/>
+          <w:sz w:val="24"/>
+          <w:szCs w:val="24"/>
+          <w:lang w:val="en-US"/>
+        </w:rPr>
+        <w:t>berdasarkan</w:t>
+      </w:r>
+      <w:proofErr w:type="spellEnd"/>
+      <w:r>
+        <w:rPr>
+          <w:color w:val="000000"/>
+          <w:sz w:val="24"/>
+          <w:szCs w:val="24"/>
+          <w:lang w:val="en-US"/>
+        </w:rPr>
+        <w:t xml:space="preserve"> </w:t>
+      </w:r>
+      <w:proofErr w:type="spellStart"/>
+      <w:r>
+        <w:rPr>
+          <w:color w:val="000000"/>
+          <w:sz w:val="24"/>
+          <w:szCs w:val="24"/>
+          <w:lang w:val="en-US"/>
+        </w:rPr>
+        <w:t>jaraknya</w:t>
+      </w:r>
+      <w:proofErr w:type="spellEnd"/>
+      <w:r>
+        <w:rPr>
+          <w:color w:val="000000"/>
+          <w:sz w:val="24"/>
+          <w:szCs w:val="24"/>
+          <w:lang w:val="en-US"/>
+        </w:rPr>
+        <w:t xml:space="preserve"> </w:t>
+      </w:r>
+      <w:proofErr w:type="spellStart"/>
+      <w:r>
+        <w:rPr>
+          <w:color w:val="000000"/>
+          <w:sz w:val="24"/>
+          <w:szCs w:val="24"/>
+          <w:lang w:val="en-US"/>
+        </w:rPr>
+        <w:t>terhadap</w:t>
+      </w:r>
+      <w:proofErr w:type="spellEnd"/>
+      <w:r>
+        <w:rPr>
+          <w:color w:val="000000"/>
+          <w:sz w:val="24"/>
+          <w:szCs w:val="24"/>
+          <w:lang w:val="en-US"/>
+        </w:rPr>
+        <w:t xml:space="preserve"> lawan yang sedang di-track.</w:t>
+      </w:r>
+    </w:p>
+    <w:p>
+      <w:pPr>
+        <w:spacing w:after="240"/>
+        <w:rPr>
+          <w:rFonts w:ascii="Times New Roman" w:hAnsi="Times New Roman"/>
+          <w:sz w:val="24"/>
+          <w:szCs w:val="24"/>
+          <w:lang w:val="en-US"/>
+        </w:rPr>
+      </w:pPr>
+    </w:p>
+    <w:p>
+      <w:pPr>
+        <w:rPr>
+          <w:rFonts w:ascii="Times New Roman" w:hAnsi="Times New Roman"/>
+          <w:sz w:val="24"/>
+          <w:szCs w:val="24"/>
+          <w:lang w:val="en-US"/>
+        </w:rPr>
+      </w:pPr>
+      <w:r>
+        <w:rPr>
+          <w:b/>
+          <w:bCs/>
+          <w:color w:val="000000"/>
+          <w:sz w:val="24"/>
+          <w:szCs w:val="24"/>
+          <w:lang w:val="en-US"/>
+        </w:rPr>
+        <w:t>RADAR LOCK &amp; MICRO SWEEP</w:t>
+      </w:r>
+    </w:p>
+    <w:p>
+      <w:pPr>
+        <w:shd w:val="clear" w:color="auto" w:fill="121314"/>
+        <w:rPr>
+          <w:rFonts w:ascii="Times New Roman" w:hAnsi="Times New Roman"/>
+          <w:sz w:val="24"/>
+          <w:szCs w:val="24"/>
+          <w:lang w:val="en-US"/>
+        </w:rPr>
+      </w:pPr>
+      <w:r>
+        <w:rPr>
+          <w:rFonts w:ascii="Consolas" w:hAnsi="Consolas"/>
+          <w:color w:val="F3F3F3"/>
+          <w:sz w:val="21"/>
+          <w:szCs w:val="21"/>
+          <w:lang w:val="en-US"/>
+        </w:rPr>
+        <w:t xml:space="preserve">double </w:t>
+      </w:r>
+      <w:proofErr w:type="spellStart"/>
+      <w:r>
+        <w:rPr>
+          <w:rFonts w:ascii="Consolas" w:hAnsi="Consolas"/>
+          <w:color w:val="F3F3F3"/>
+          <w:sz w:val="21"/>
+          <w:szCs w:val="21"/>
+          <w:lang w:val="en-US"/>
+        </w:rPr>
+        <w:t>radarBearing</w:t>
+      </w:r>
+      <w:proofErr w:type="spellEnd"/>
+      <w:r>
+        <w:rPr>
+          <w:rFonts w:ascii="Consolas" w:hAnsi="Consolas"/>
+          <w:color w:val="F3F3F3"/>
+          <w:sz w:val="21"/>
+          <w:szCs w:val="21"/>
+          <w:lang w:val="en-US"/>
+        </w:rPr>
+        <w:t xml:space="preserve"> = </w:t>
+      </w:r>
+      <w:proofErr w:type="spellStart"/>
+      <w:proofErr w:type="gramStart"/>
+      <w:r>
+        <w:rPr>
+          <w:rFonts w:ascii="Consolas" w:hAnsi="Consolas"/>
+          <w:color w:val="F3F3F3"/>
+          <w:sz w:val="21"/>
+          <w:szCs w:val="21"/>
+          <w:lang w:val="en-US"/>
+        </w:rPr>
+        <w:t>NormalizeRelativeAngle</w:t>
+      </w:r>
+      <w:proofErr w:type="spellEnd"/>
+      <w:r>
+        <w:rPr>
+          <w:rFonts w:ascii="Consolas" w:hAnsi="Consolas"/>
+          <w:color w:val="F3F3F3"/>
+          <w:sz w:val="21"/>
+          <w:szCs w:val="21"/>
+          <w:lang w:val="en-US"/>
+        </w:rPr>
+        <w:t>(</w:t>
+      </w:r>
+      <w:proofErr w:type="spellStart"/>
+      <w:proofErr w:type="gramEnd"/>
+      <w:r>
+        <w:rPr>
+          <w:rFonts w:ascii="Consolas" w:hAnsi="Consolas"/>
+          <w:color w:val="F3F3F3"/>
+          <w:sz w:val="21"/>
+          <w:szCs w:val="21"/>
+          <w:lang w:val="en-US"/>
+        </w:rPr>
+        <w:t>absoluteDirection</w:t>
+      </w:r>
+      <w:proofErr w:type="spellEnd"/>
+      <w:r>
+        <w:rPr>
+          <w:rFonts w:ascii="Consolas" w:hAnsi="Consolas"/>
+          <w:color w:val="F3F3F3"/>
+          <w:sz w:val="21"/>
+          <w:szCs w:val="21"/>
+          <w:lang w:val="en-US"/>
+        </w:rPr>
+        <w:t xml:space="preserve"> - </w:t>
+      </w:r>
+      <w:proofErr w:type="spellStart"/>
+      <w:r>
+        <w:rPr>
+          <w:rFonts w:ascii="Consolas" w:hAnsi="Consolas"/>
+          <w:color w:val="F3F3F3"/>
+          <w:sz w:val="21"/>
+          <w:szCs w:val="21"/>
+          <w:lang w:val="en-US"/>
+        </w:rPr>
+        <w:t>RadarDirection</w:t>
+      </w:r>
+      <w:proofErr w:type="spellEnd"/>
+      <w:r>
+        <w:rPr>
+          <w:rFonts w:ascii="Consolas" w:hAnsi="Consolas"/>
+          <w:color w:val="F3F3F3"/>
+          <w:sz w:val="21"/>
+          <w:szCs w:val="21"/>
+          <w:lang w:val="en-US"/>
+        </w:rPr>
+        <w:t>); </w:t>
+      </w:r>
+    </w:p>
+    <w:p>
+      <w:pPr>
+        <w:shd w:val="clear" w:color="auto" w:fill="121314"/>
+        <w:rPr>
+          <w:rFonts w:ascii="Times New Roman" w:hAnsi="Times New Roman"/>
+          <w:sz w:val="24"/>
+          <w:szCs w:val="24"/>
+          <w:lang w:val="en-US"/>
+        </w:rPr>
+      </w:pPr>
+      <w:r>
+        <w:rPr>
+          <w:rFonts w:ascii="Consolas" w:hAnsi="Consolas"/>
+          <w:color w:val="F3F3F3"/>
+          <w:sz w:val="21"/>
+          <w:szCs w:val="21"/>
+          <w:lang w:val="en-US"/>
+        </w:rPr>
+        <w:t xml:space="preserve">double </w:t>
+      </w:r>
+      <w:proofErr w:type="spellStart"/>
+      <w:r>
+        <w:rPr>
+          <w:rFonts w:ascii="Consolas" w:hAnsi="Consolas"/>
+          <w:color w:val="F3F3F3"/>
+          <w:sz w:val="21"/>
+          <w:szCs w:val="21"/>
+          <w:lang w:val="en-US"/>
+        </w:rPr>
+        <w:t>microSweep</w:t>
+      </w:r>
+      <w:proofErr w:type="spellEnd"/>
+      <w:r>
+        <w:rPr>
+          <w:rFonts w:ascii="Consolas" w:hAnsi="Consolas"/>
+          <w:color w:val="F3F3F3"/>
+          <w:sz w:val="21"/>
+          <w:szCs w:val="21"/>
+          <w:lang w:val="en-US"/>
+        </w:rPr>
+        <w:t xml:space="preserve"> = (</w:t>
+      </w:r>
+      <w:proofErr w:type="spellStart"/>
+      <w:r>
+        <w:rPr>
+          <w:rFonts w:ascii="Consolas" w:hAnsi="Consolas"/>
+          <w:color w:val="F3F3F3"/>
+          <w:sz w:val="21"/>
+          <w:szCs w:val="21"/>
+          <w:lang w:val="en-US"/>
+        </w:rPr>
+        <w:t>trackScanTicks</w:t>
+      </w:r>
+      <w:proofErr w:type="spellEnd"/>
+      <w:r>
+        <w:rPr>
+          <w:rFonts w:ascii="Consolas" w:hAnsi="Consolas"/>
+          <w:color w:val="F3F3F3"/>
+          <w:sz w:val="21"/>
+          <w:szCs w:val="21"/>
+          <w:lang w:val="en-US"/>
+        </w:rPr>
+        <w:t xml:space="preserve"> % 2 == 0</w:t>
+      </w:r>
+      <w:proofErr w:type="gramStart"/>
+      <w:r>
+        <w:rPr>
+          <w:rFonts w:ascii="Consolas" w:hAnsi="Consolas"/>
+          <w:color w:val="F3F3F3"/>
+          <w:sz w:val="21"/>
+          <w:szCs w:val="21"/>
+          <w:lang w:val="en-US"/>
+        </w:rPr>
+        <w:t>) ?</w:t>
+      </w:r>
+      <w:proofErr w:type="gramEnd"/>
+      <w:r>
+        <w:rPr>
+          <w:rFonts w:ascii="Consolas" w:hAnsi="Consolas"/>
+          <w:color w:val="F3F3F3"/>
+          <w:sz w:val="21"/>
+          <w:szCs w:val="21"/>
+          <w:lang w:val="en-US"/>
+        </w:rPr>
+        <w:t xml:space="preserve"> </w:t>
+      </w:r>
+      <w:proofErr w:type="gramStart"/>
+      <w:r>
+        <w:rPr>
+          <w:rFonts w:ascii="Consolas" w:hAnsi="Consolas"/>
+          <w:color w:val="F3F3F3"/>
+          <w:sz w:val="21"/>
+          <w:szCs w:val="21"/>
+          <w:lang w:val="en-US"/>
+        </w:rPr>
+        <w:t>6 :</w:t>
+      </w:r>
+      <w:proofErr w:type="gramEnd"/>
+      <w:r>
+        <w:rPr>
+          <w:rFonts w:ascii="Consolas" w:hAnsi="Consolas"/>
+          <w:color w:val="F3F3F3"/>
+          <w:sz w:val="21"/>
+          <w:szCs w:val="21"/>
+          <w:lang w:val="en-US"/>
+        </w:rPr>
+        <w:t xml:space="preserve"> -6; </w:t>
+      </w:r>
+      <w:proofErr w:type="spellStart"/>
+      <w:proofErr w:type="gramStart"/>
+      <w:r>
+        <w:rPr>
+          <w:rFonts w:ascii="Consolas" w:hAnsi="Consolas"/>
+          <w:color w:val="F3F3F3"/>
+          <w:sz w:val="21"/>
+          <w:szCs w:val="21"/>
+          <w:lang w:val="en-US"/>
+        </w:rPr>
+        <w:t>SetTurnRadarLeft</w:t>
+      </w:r>
+      <w:proofErr w:type="spellEnd"/>
+      <w:r>
+        <w:rPr>
+          <w:rFonts w:ascii="Consolas" w:hAnsi="Consolas"/>
+          <w:color w:val="F3F3F3"/>
+          <w:sz w:val="21"/>
+          <w:szCs w:val="21"/>
+          <w:lang w:val="en-US"/>
+        </w:rPr>
+        <w:t>(</w:t>
+      </w:r>
+      <w:proofErr w:type="spellStart"/>
+      <w:proofErr w:type="gramEnd"/>
+      <w:r>
+        <w:rPr>
+          <w:rFonts w:ascii="Consolas" w:hAnsi="Consolas"/>
+          <w:color w:val="F3F3F3"/>
+          <w:sz w:val="21"/>
+          <w:szCs w:val="21"/>
+          <w:lang w:val="en-US"/>
+        </w:rPr>
+        <w:t>radarBearing</w:t>
+      </w:r>
+      <w:proofErr w:type="spellEnd"/>
+      <w:r>
+        <w:rPr>
+          <w:rFonts w:ascii="Consolas" w:hAnsi="Consolas"/>
+          <w:color w:val="F3F3F3"/>
+          <w:sz w:val="21"/>
+          <w:szCs w:val="21"/>
+          <w:lang w:val="en-US"/>
+        </w:rPr>
+        <w:t xml:space="preserve"> + </w:t>
+      </w:r>
+      <w:proofErr w:type="spellStart"/>
+      <w:r>
+        <w:rPr>
+          <w:rFonts w:ascii="Consolas" w:hAnsi="Consolas"/>
+          <w:color w:val="F3F3F3"/>
+          <w:sz w:val="21"/>
+          <w:szCs w:val="21"/>
+          <w:lang w:val="en-US"/>
+        </w:rPr>
+        <w:t>microSweep</w:t>
+      </w:r>
+      <w:proofErr w:type="spellEnd"/>
+      <w:r>
+        <w:rPr>
+          <w:rFonts w:ascii="Consolas" w:hAnsi="Consolas"/>
+          <w:color w:val="F3F3F3"/>
+          <w:sz w:val="21"/>
+          <w:szCs w:val="21"/>
+          <w:lang w:val="en-US"/>
+        </w:rPr>
+        <w:t>); </w:t>
+      </w:r>
+    </w:p>
+    <w:p>
+      <w:pPr>
+        <w:rPr>
+          <w:rFonts w:ascii="Times New Roman" w:hAnsi="Times New Roman"/>
+          <w:sz w:val="24"/>
+          <w:szCs w:val="24"/>
+          <w:lang w:val="en-US"/>
+        </w:rPr>
+      </w:pPr>
+    </w:p>
+    <w:p>
+      <w:pPr>
+        <w:rPr>
+          <w:rFonts w:ascii="Times New Roman" w:hAnsi="Times New Roman"/>
+          <w:sz w:val="24"/>
+          <w:szCs w:val="24"/>
+          <w:lang w:val="en-US"/>
+        </w:rPr>
+      </w:pPr>
+      <w:r>
+        <w:rPr>
+          <w:color w:val="000000"/>
+          <w:sz w:val="24"/>
+          <w:szCs w:val="24"/>
+          <w:lang w:val="en-US"/>
+        </w:rPr>
+        <w:t xml:space="preserve">Untuk </w:t>
+      </w:r>
+      <w:proofErr w:type="spellStart"/>
+      <w:r>
+        <w:rPr>
+          <w:color w:val="000000"/>
+          <w:sz w:val="24"/>
+          <w:szCs w:val="24"/>
+          <w:lang w:val="en-US"/>
+        </w:rPr>
+        <w:t>memastikan</w:t>
+      </w:r>
+      <w:proofErr w:type="spellEnd"/>
+      <w:r>
+        <w:rPr>
+          <w:color w:val="000000"/>
+          <w:sz w:val="24"/>
+          <w:szCs w:val="24"/>
+          <w:lang w:val="en-US"/>
+        </w:rPr>
+        <w:t xml:space="preserve"> target tidak </w:t>
+      </w:r>
+      <w:proofErr w:type="spellStart"/>
+      <w:r>
+        <w:rPr>
+          <w:color w:val="000000"/>
+          <w:sz w:val="24"/>
+          <w:szCs w:val="24"/>
+          <w:lang w:val="en-US"/>
+        </w:rPr>
+        <w:t>hilang</w:t>
+      </w:r>
+      <w:proofErr w:type="spellEnd"/>
+      <w:r>
+        <w:rPr>
+          <w:color w:val="000000"/>
+          <w:sz w:val="24"/>
+          <w:szCs w:val="24"/>
+          <w:lang w:val="en-US"/>
+        </w:rPr>
+        <w:t xml:space="preserve"> maka Vernon </w:t>
+      </w:r>
+      <w:proofErr w:type="spellStart"/>
+      <w:r>
+        <w:rPr>
+          <w:color w:val="000000"/>
+          <w:sz w:val="24"/>
+          <w:szCs w:val="24"/>
+          <w:lang w:val="en-US"/>
+        </w:rPr>
+        <w:t>akan</w:t>
+      </w:r>
+      <w:proofErr w:type="spellEnd"/>
+      <w:r>
+        <w:rPr>
+          <w:color w:val="000000"/>
+          <w:sz w:val="24"/>
+          <w:szCs w:val="24"/>
+          <w:lang w:val="en-US"/>
+        </w:rPr>
+        <w:t xml:space="preserve"> </w:t>
+      </w:r>
+      <w:proofErr w:type="spellStart"/>
+      <w:r>
+        <w:rPr>
+          <w:color w:val="000000"/>
+          <w:sz w:val="24"/>
+          <w:szCs w:val="24"/>
+          <w:lang w:val="en-US"/>
+        </w:rPr>
+        <w:t>melakukan</w:t>
+      </w:r>
+      <w:proofErr w:type="spellEnd"/>
+      <w:r>
+        <w:rPr>
+          <w:color w:val="000000"/>
+          <w:sz w:val="24"/>
+          <w:szCs w:val="24"/>
+          <w:lang w:val="en-US"/>
+        </w:rPr>
+        <w:t xml:space="preserve"> micro-sweep dimana radar </w:t>
+      </w:r>
+      <w:proofErr w:type="spellStart"/>
+      <w:r>
+        <w:rPr>
+          <w:color w:val="000000"/>
+          <w:sz w:val="24"/>
+          <w:szCs w:val="24"/>
+          <w:lang w:val="en-US"/>
+        </w:rPr>
+        <w:t>akan</w:t>
+      </w:r>
+      <w:proofErr w:type="spellEnd"/>
+      <w:r>
+        <w:rPr>
+          <w:color w:val="000000"/>
+          <w:sz w:val="24"/>
+          <w:szCs w:val="24"/>
+          <w:lang w:val="en-US"/>
+        </w:rPr>
+        <w:t xml:space="preserve"> sedikit </w:t>
+      </w:r>
+      <w:proofErr w:type="spellStart"/>
+      <w:r>
+        <w:rPr>
+          <w:color w:val="000000"/>
+          <w:sz w:val="24"/>
+          <w:szCs w:val="24"/>
+          <w:lang w:val="en-US"/>
+        </w:rPr>
+        <w:t>bergetar</w:t>
+      </w:r>
+      <w:proofErr w:type="spellEnd"/>
+      <w:r>
+        <w:rPr>
+          <w:color w:val="000000"/>
+          <w:sz w:val="24"/>
+          <w:szCs w:val="24"/>
+          <w:lang w:val="en-US"/>
+        </w:rPr>
+        <w:t xml:space="preserve"> untuk </w:t>
+      </w:r>
+      <w:proofErr w:type="spellStart"/>
+      <w:r>
+        <w:rPr>
+          <w:color w:val="000000"/>
+          <w:sz w:val="24"/>
+          <w:szCs w:val="24"/>
+          <w:lang w:val="en-US"/>
+        </w:rPr>
+        <w:t>mendapatkan</w:t>
+      </w:r>
+      <w:proofErr w:type="spellEnd"/>
+      <w:r>
+        <w:rPr>
+          <w:color w:val="000000"/>
+          <w:sz w:val="24"/>
+          <w:szCs w:val="24"/>
+          <w:lang w:val="en-US"/>
+        </w:rPr>
+        <w:t xml:space="preserve"> data musuh </w:t>
+      </w:r>
+      <w:proofErr w:type="spellStart"/>
+      <w:r>
+        <w:rPr>
+          <w:color w:val="000000"/>
+          <w:sz w:val="24"/>
+          <w:szCs w:val="24"/>
+          <w:lang w:val="en-US"/>
+        </w:rPr>
+        <w:t>terbaru</w:t>
+      </w:r>
+      <w:proofErr w:type="spellEnd"/>
+      <w:r>
+        <w:rPr>
+          <w:color w:val="000000"/>
+          <w:sz w:val="24"/>
+          <w:szCs w:val="24"/>
+          <w:lang w:val="en-US"/>
+        </w:rPr>
+        <w:t>.</w:t>
+      </w:r>
+    </w:p>
+    <w:p>
+      <w:pPr>
+        <w:rPr>
+          <w:rFonts w:ascii="Times New Roman" w:hAnsi="Times New Roman"/>
+          <w:sz w:val="24"/>
+          <w:szCs w:val="24"/>
+          <w:lang w:val="en-US"/>
+        </w:rPr>
+      </w:pPr>
+    </w:p>
+    <w:p>
+      <w:pPr>
+        <w:rPr>
+          <w:rFonts w:ascii="Times New Roman" w:hAnsi="Times New Roman"/>
+          <w:sz w:val="24"/>
+          <w:szCs w:val="24"/>
+          <w:lang w:val="en-US"/>
+        </w:rPr>
+      </w:pPr>
+      <w:r>
+        <w:rPr>
+          <w:b/>
+          <w:bCs/>
+          <w:color w:val="000000"/>
+          <w:sz w:val="24"/>
+          <w:szCs w:val="24"/>
+          <w:lang w:val="en-US"/>
+        </w:rPr>
+        <w:t>ANTI-JAM </w:t>
+      </w:r>
+    </w:p>
+    <w:p>
+      <w:pPr>
+        <w:shd w:val="clear" w:color="auto" w:fill="121314"/>
+        <w:rPr>
+          <w:rFonts w:ascii="Times New Roman" w:hAnsi="Times New Roman"/>
+          <w:sz w:val="24"/>
+          <w:szCs w:val="24"/>
+          <w:lang w:val="en-US"/>
+        </w:rPr>
+      </w:pPr>
+      <w:r>
+        <w:rPr>
+          <w:rFonts w:ascii="Consolas" w:hAnsi="Consolas"/>
+          <w:color w:val="EFEFEF"/>
+          <w:sz w:val="21"/>
+          <w:szCs w:val="21"/>
+          <w:lang w:val="en-US"/>
+        </w:rPr>
+        <w:t xml:space="preserve">public override void </w:t>
+      </w:r>
+      <w:proofErr w:type="spellStart"/>
+      <w:proofErr w:type="gramStart"/>
+      <w:r>
+        <w:rPr>
+          <w:rFonts w:ascii="Consolas" w:hAnsi="Consolas"/>
+          <w:color w:val="EFEFEF"/>
+          <w:sz w:val="21"/>
+          <w:szCs w:val="21"/>
+          <w:lang w:val="en-US"/>
+        </w:rPr>
+        <w:t>OnHitBot</w:t>
+      </w:r>
+      <w:proofErr w:type="spellEnd"/>
+      <w:r>
+        <w:rPr>
+          <w:rFonts w:ascii="Consolas" w:hAnsi="Consolas"/>
+          <w:color w:val="EFEFEF"/>
+          <w:sz w:val="21"/>
+          <w:szCs w:val="21"/>
+          <w:lang w:val="en-US"/>
+        </w:rPr>
+        <w:t>(</w:t>
+      </w:r>
+      <w:proofErr w:type="spellStart"/>
+      <w:proofErr w:type="gramEnd"/>
+      <w:r>
+        <w:rPr>
+          <w:rFonts w:ascii="Consolas" w:hAnsi="Consolas"/>
+          <w:color w:val="EFEFEF"/>
+          <w:sz w:val="21"/>
+          <w:szCs w:val="21"/>
+          <w:lang w:val="en-US"/>
+        </w:rPr>
+        <w:t>HitBotEvent</w:t>
+      </w:r>
+      <w:proofErr w:type="spellEnd"/>
+      <w:r>
+        <w:rPr>
+          <w:rFonts w:ascii="Consolas" w:hAnsi="Consolas"/>
+          <w:color w:val="EFEFEF"/>
+          <w:sz w:val="21"/>
+          <w:szCs w:val="21"/>
+          <w:lang w:val="en-US"/>
+        </w:rPr>
+        <w:t xml:space="preserve"> e)</w:t>
+      </w:r>
+    </w:p>
+    <w:p>
+      <w:pPr>
+        <w:shd w:val="clear" w:color="auto" w:fill="121314"/>
+        <w:rPr>
+          <w:rFonts w:ascii="Times New Roman" w:hAnsi="Times New Roman"/>
+          <w:sz w:val="24"/>
+          <w:szCs w:val="24"/>
+          <w:lang w:val="en-US"/>
+        </w:rPr>
+      </w:pPr>
+      <w:r>
+        <w:rPr>
+          <w:rFonts w:ascii="Consolas" w:hAnsi="Consolas"/>
+          <w:color w:val="EFEFEF"/>
+          <w:sz w:val="21"/>
+          <w:szCs w:val="21"/>
+          <w:lang w:val="en-US"/>
+        </w:rPr>
+        <w:t>    {</w:t>
+      </w:r>
+    </w:p>
+    <w:p>
+      <w:pPr>
+        <w:shd w:val="clear" w:color="auto" w:fill="121314"/>
+        <w:rPr>
+          <w:rFonts w:ascii="Times New Roman" w:hAnsi="Times New Roman"/>
+          <w:sz w:val="24"/>
+          <w:szCs w:val="24"/>
+          <w:lang w:val="en-US"/>
+        </w:rPr>
+      </w:pPr>
+      <w:r>
+        <w:rPr>
+          <w:rFonts w:ascii="Consolas" w:hAnsi="Consolas"/>
+          <w:color w:val="EFEFEF"/>
+          <w:sz w:val="21"/>
+          <w:szCs w:val="21"/>
+          <w:lang w:val="en-US"/>
+        </w:rPr>
+        <w:t>        </w:t>
+      </w:r>
+      <w:proofErr w:type="spellStart"/>
+      <w:r>
+        <w:rPr>
+          <w:rFonts w:ascii="Consolas" w:hAnsi="Consolas"/>
+          <w:color w:val="EFEFEF"/>
+          <w:sz w:val="21"/>
+          <w:szCs w:val="21"/>
+          <w:lang w:val="en-US"/>
+        </w:rPr>
+        <w:t>moveDirection</w:t>
+      </w:r>
+      <w:proofErr w:type="spellEnd"/>
+      <w:r>
+        <w:rPr>
+          <w:rFonts w:ascii="Consolas" w:hAnsi="Consolas"/>
+          <w:color w:val="EFEFEF"/>
+          <w:sz w:val="21"/>
+          <w:szCs w:val="21"/>
+          <w:lang w:val="en-US"/>
+        </w:rPr>
+        <w:t xml:space="preserve"> *= -1;</w:t>
+      </w:r>
+    </w:p>
+    <w:p>
+      <w:pPr>
+        <w:shd w:val="clear" w:color="auto" w:fill="121314"/>
+        <w:rPr>
+          <w:rFonts w:ascii="Times New Roman" w:hAnsi="Times New Roman"/>
+          <w:sz w:val="24"/>
+          <w:szCs w:val="24"/>
+          <w:lang w:val="en-US"/>
+        </w:rPr>
+      </w:pPr>
+      <w:r>
+        <w:rPr>
+          <w:rFonts w:ascii="Consolas" w:hAnsi="Consolas"/>
+          <w:color w:val="EFEFEF"/>
+          <w:sz w:val="21"/>
+          <w:szCs w:val="21"/>
+          <w:lang w:val="en-US"/>
+        </w:rPr>
+        <w:t>    }</w:t>
+      </w:r>
+    </w:p>
+    <w:p>
+      <w:pPr>
+        <w:shd w:val="clear" w:color="auto" w:fill="121314"/>
+        <w:rPr>
+          <w:rFonts w:ascii="Times New Roman" w:hAnsi="Times New Roman"/>
+          <w:sz w:val="24"/>
+          <w:szCs w:val="24"/>
+          <w:lang w:val="en-US"/>
+        </w:rPr>
+      </w:pPr>
+      <w:r>
+        <w:rPr>
+          <w:rFonts w:ascii="Consolas" w:hAnsi="Consolas"/>
+          <w:color w:val="EFEFEF"/>
+          <w:sz w:val="21"/>
+          <w:szCs w:val="21"/>
+          <w:lang w:val="en-US"/>
+        </w:rPr>
+        <w:t xml:space="preserve">public override void </w:t>
+      </w:r>
+      <w:proofErr w:type="spellStart"/>
+      <w:proofErr w:type="gramStart"/>
+      <w:r>
+        <w:rPr>
+          <w:rFonts w:ascii="Consolas" w:hAnsi="Consolas"/>
+          <w:color w:val="EFEFEF"/>
+          <w:sz w:val="21"/>
+          <w:szCs w:val="21"/>
+          <w:lang w:val="en-US"/>
+        </w:rPr>
+        <w:t>OnHitWall</w:t>
+      </w:r>
+      <w:proofErr w:type="spellEnd"/>
+      <w:r>
+        <w:rPr>
+          <w:rFonts w:ascii="Consolas" w:hAnsi="Consolas"/>
+          <w:color w:val="EFEFEF"/>
+          <w:sz w:val="21"/>
+          <w:szCs w:val="21"/>
+          <w:lang w:val="en-US"/>
+        </w:rPr>
+        <w:t>(</w:t>
+      </w:r>
+      <w:proofErr w:type="spellStart"/>
+      <w:proofErr w:type="gramEnd"/>
+      <w:r>
+        <w:rPr>
+          <w:rFonts w:ascii="Consolas" w:hAnsi="Consolas"/>
+          <w:color w:val="EFEFEF"/>
+          <w:sz w:val="21"/>
+          <w:szCs w:val="21"/>
+          <w:lang w:val="en-US"/>
+        </w:rPr>
+        <w:t>HitWallEvent</w:t>
+      </w:r>
+      <w:proofErr w:type="spellEnd"/>
+      <w:r>
+        <w:rPr>
+          <w:rFonts w:ascii="Consolas" w:hAnsi="Consolas"/>
+          <w:color w:val="EFEFEF"/>
+          <w:sz w:val="21"/>
+          <w:szCs w:val="21"/>
+          <w:lang w:val="en-US"/>
+        </w:rPr>
+        <w:t xml:space="preserve"> e)</w:t>
+      </w:r>
+    </w:p>
+    <w:p>
+      <w:pPr>
+        <w:shd w:val="clear" w:color="auto" w:fill="121314"/>
+        <w:rPr>
+          <w:rFonts w:ascii="Times New Roman" w:hAnsi="Times New Roman"/>
+          <w:sz w:val="24"/>
+          <w:szCs w:val="24"/>
+          <w:lang w:val="en-US"/>
+        </w:rPr>
+      </w:pPr>
+      <w:r>
+        <w:rPr>
+          <w:rFonts w:ascii="Consolas" w:hAnsi="Consolas"/>
+          <w:color w:val="EFEFEF"/>
+          <w:sz w:val="21"/>
+          <w:szCs w:val="21"/>
+          <w:lang w:val="en-US"/>
+        </w:rPr>
+        <w:t>    {</w:t>
+      </w:r>
+    </w:p>
+    <w:p>
+      <w:pPr>
+        <w:shd w:val="clear" w:color="auto" w:fill="121314"/>
+        <w:rPr>
+          <w:rFonts w:ascii="Times New Roman" w:hAnsi="Times New Roman"/>
+          <w:sz w:val="24"/>
+          <w:szCs w:val="24"/>
+          <w:lang w:val="en-US"/>
+        </w:rPr>
+      </w:pPr>
+      <w:r>
+        <w:rPr>
+          <w:rFonts w:ascii="Consolas" w:hAnsi="Consolas"/>
+          <w:color w:val="EFEFEF"/>
+          <w:sz w:val="21"/>
+          <w:szCs w:val="21"/>
+          <w:lang w:val="en-US"/>
+        </w:rPr>
+        <w:t>        </w:t>
+      </w:r>
+      <w:proofErr w:type="spellStart"/>
+      <w:r>
+        <w:rPr>
+          <w:rFonts w:ascii="Consolas" w:hAnsi="Consolas"/>
+          <w:color w:val="EFEFEF"/>
+          <w:sz w:val="21"/>
+          <w:szCs w:val="21"/>
+          <w:lang w:val="en-US"/>
+        </w:rPr>
+        <w:t>moveDirection</w:t>
+      </w:r>
+      <w:proofErr w:type="spellEnd"/>
+      <w:r>
+        <w:rPr>
+          <w:rFonts w:ascii="Consolas" w:hAnsi="Consolas"/>
+          <w:color w:val="EFEFEF"/>
+          <w:sz w:val="21"/>
+          <w:szCs w:val="21"/>
+          <w:lang w:val="en-US"/>
+        </w:rPr>
+        <w:t xml:space="preserve"> *= -1;</w:t>
+      </w:r>
+    </w:p>
+    <w:p>
+      <w:pPr>
+        <w:shd w:val="clear" w:color="auto" w:fill="121314"/>
+        <w:rPr>
+          <w:rFonts w:ascii="Times New Roman" w:hAnsi="Times New Roman"/>
+          <w:sz w:val="24"/>
+          <w:szCs w:val="24"/>
+          <w:lang w:val="en-US"/>
+        </w:rPr>
+      </w:pPr>
+      <w:r>
+        <w:rPr>
+          <w:rFonts w:ascii="Consolas" w:hAnsi="Consolas"/>
+          <w:color w:val="EFEFEF"/>
+          <w:sz w:val="21"/>
+          <w:szCs w:val="21"/>
+          <w:lang w:val="en-US"/>
+        </w:rPr>
+        <w:t>    }</w:t>
+      </w:r>
+    </w:p>
+    <w:p>
+      <w:pPr>
+        <w:rPr>
+          <w:rFonts w:ascii="Times New Roman" w:hAnsi="Times New Roman"/>
+          <w:sz w:val="24"/>
+          <w:szCs w:val="24"/>
+          <w:lang w:val="en-US"/>
+        </w:rPr>
+      </w:pPr>
+    </w:p>
+    <w:p>
+      <w:pPr>
+        <w:rPr>
+          <w:rFonts w:ascii="Times New Roman" w:hAnsi="Times New Roman"/>
+          <w:sz w:val="24"/>
+          <w:szCs w:val="24"/>
+          <w:lang w:val="en-US"/>
+        </w:rPr>
+      </w:pPr>
+      <w:proofErr w:type="spellStart"/>
+      <w:r>
+        <w:rPr>
+          <w:color w:val="000000"/>
+          <w:sz w:val="24"/>
+          <w:szCs w:val="24"/>
+          <w:lang w:val="en-US"/>
+        </w:rPr>
+        <w:t>Sistem</w:t>
+      </w:r>
+      <w:proofErr w:type="spellEnd"/>
+      <w:r>
+        <w:rPr>
+          <w:color w:val="000000"/>
+          <w:sz w:val="24"/>
+          <w:szCs w:val="24"/>
+          <w:lang w:val="en-US"/>
+        </w:rPr>
+        <w:t xml:space="preserve"> ini </w:t>
+      </w:r>
+      <w:proofErr w:type="spellStart"/>
+      <w:r>
+        <w:rPr>
+          <w:color w:val="000000"/>
+          <w:sz w:val="24"/>
+          <w:szCs w:val="24"/>
+          <w:lang w:val="en-US"/>
+        </w:rPr>
+        <w:t>akan</w:t>
+      </w:r>
+      <w:proofErr w:type="spellEnd"/>
+      <w:r>
+        <w:rPr>
+          <w:color w:val="000000"/>
+          <w:sz w:val="24"/>
+          <w:szCs w:val="24"/>
+          <w:lang w:val="en-US"/>
+        </w:rPr>
+        <w:t xml:space="preserve"> </w:t>
+      </w:r>
+      <w:proofErr w:type="spellStart"/>
+      <w:r>
+        <w:rPr>
+          <w:color w:val="000000"/>
+          <w:sz w:val="24"/>
+          <w:szCs w:val="24"/>
+          <w:lang w:val="en-US"/>
+        </w:rPr>
+        <w:t>memastikan</w:t>
+      </w:r>
+      <w:proofErr w:type="spellEnd"/>
+      <w:r>
+        <w:rPr>
+          <w:color w:val="000000"/>
+          <w:sz w:val="24"/>
+          <w:szCs w:val="24"/>
+          <w:lang w:val="en-US"/>
+        </w:rPr>
+        <w:t xml:space="preserve"> Vernon tidak stuck pada </w:t>
+      </w:r>
+      <w:proofErr w:type="spellStart"/>
+      <w:r>
+        <w:rPr>
+          <w:color w:val="000000"/>
+          <w:sz w:val="24"/>
+          <w:szCs w:val="24"/>
+          <w:lang w:val="en-US"/>
+        </w:rPr>
+        <w:t>satu</w:t>
+      </w:r>
+      <w:proofErr w:type="spellEnd"/>
+      <w:r>
+        <w:rPr>
+          <w:color w:val="000000"/>
+          <w:sz w:val="24"/>
+          <w:szCs w:val="24"/>
+          <w:lang w:val="en-US"/>
+        </w:rPr>
+        <w:t xml:space="preserve"> </w:t>
+      </w:r>
+      <w:proofErr w:type="spellStart"/>
+      <w:r>
+        <w:rPr>
+          <w:color w:val="000000"/>
+          <w:sz w:val="24"/>
+          <w:szCs w:val="24"/>
+          <w:lang w:val="en-US"/>
+        </w:rPr>
+        <w:t>posisi</w:t>
+      </w:r>
+      <w:proofErr w:type="spellEnd"/>
+      <w:r>
+        <w:rPr>
+          <w:color w:val="000000"/>
+          <w:sz w:val="24"/>
+          <w:szCs w:val="24"/>
+          <w:lang w:val="en-US"/>
+        </w:rPr>
+        <w:t xml:space="preserve"> dan bisa </w:t>
+      </w:r>
+      <w:proofErr w:type="spellStart"/>
+      <w:r>
+        <w:rPr>
+          <w:color w:val="000000"/>
+          <w:sz w:val="24"/>
+          <w:szCs w:val="24"/>
+          <w:lang w:val="en-US"/>
+        </w:rPr>
+        <w:t>bergereak</w:t>
+      </w:r>
+      <w:proofErr w:type="spellEnd"/>
+      <w:r>
+        <w:rPr>
+          <w:color w:val="000000"/>
+          <w:sz w:val="24"/>
+          <w:szCs w:val="24"/>
+          <w:lang w:val="en-US"/>
+        </w:rPr>
+        <w:t xml:space="preserve"> </w:t>
+      </w:r>
+      <w:proofErr w:type="spellStart"/>
+      <w:r>
+        <w:rPr>
+          <w:color w:val="000000"/>
+          <w:sz w:val="24"/>
+          <w:szCs w:val="24"/>
+          <w:lang w:val="en-US"/>
+        </w:rPr>
+        <w:t>kempali</w:t>
+      </w:r>
+      <w:proofErr w:type="spellEnd"/>
+      <w:r>
+        <w:rPr>
+          <w:color w:val="000000"/>
+          <w:sz w:val="24"/>
+          <w:szCs w:val="24"/>
+          <w:lang w:val="en-US"/>
+        </w:rPr>
+        <w:t xml:space="preserve"> dengan cepat.</w:t>
+      </w:r>
+    </w:p>
+    <w:p>
+      <w:pPr>
+        <w:ind w:left="810" w:right="529"/>
+        <w:jc w:val="center"/>
+        <w:rPr>
+          <w:sz w:val="22"/>
+          <w:szCs w:val="28"/>
+          <w:lang w:val="en-US"/>
+        </w:rPr>
+      </w:pPr>
+    </w:p>
+    <w:p>
+      <w:pPr>
+        <w:ind w:left="810" w:right="529"/>
+        <w:jc w:val="center"/>
+        <w:rPr>
           <w:spacing w:val="-5"/>
           <w:sz w:val="14"/>
           <w:szCs w:val="18"/>
         </w:rPr>
       </w:pPr>
-      <w:r>
-        <w:rPr>
-          <w:sz w:val="22"/>
-          <w:szCs w:val="28"/>
-          <w:lang w:val="en-US"/>
-        </w:rPr>
-        <w:t>Exhibit A. Demo Bot Vs Match Up Advantage (Nomad, Gustav, Tinman)</w:t>
-      </w:r>
     </w:p>
     <w:p>
       <w:pPr>
@@ -23878,7 +26576,7 @@
           <w:color w:val="auto"/>
         </w:rPr>
       </w:pPr>
-      <w:bookmarkStart w:id="8" w:name="_Toc230461026"/>
+      <w:bookmarkStart w:id="7" w:name="_Toc230461026"/>
       <w:r>
         <w:rPr>
           <w:color w:val="auto"/>
@@ -23903,7 +26601,7 @@
         </w:rPr>
         <w:t>Kesimpulan</w:t>
       </w:r>
-      <w:bookmarkEnd w:id="8"/>
+      <w:bookmarkEnd w:id="7"/>
     </w:p>
     <w:p>
       <w:pPr>
@@ -25991,7 +28689,6 @@
   <w:style w:type="character" w:default="1" w:styleId="DefaultParagraphFont">
     <w:name w:val="Default Paragraph Font"/>
     <w:uiPriority w:val="1"/>
-    <w:semiHidden/>
     <w:unhideWhenUsed/>
   </w:style>
   <w:style w:type="table" w:default="1" w:styleId="TableNormal">

</xml_diff>

<commit_message>
Doc: Update Link Github dokumen laporan
</commit_message>
<xml_diff>
--- a/doc/Laporan Tubes STIMA RB - Gundam KW.docx
+++ b/doc/Laporan Tubes STIMA RB - Gundam KW.docx
@@ -27538,8 +27538,9 @@
         <w:jc w:val="both"/>
         <w:rPr>
           <w:rStyle w:val="SubtleReference"/>
-          <w:sz w:val="24"/>
-          <w:szCs w:val="32"/>
+          <w:rFonts w:asciiTheme="majorHAnsi" w:hAnsiTheme="majorHAnsi" w:cstheme="majorHAnsi"/>
+          <w:sz w:val="22"/>
+          <w:szCs w:val="28"/>
         </w:rPr>
       </w:pPr>
       <w:r>
@@ -27603,6 +27604,17 @@
           <w:szCs w:val="32"/>
         </w:rPr>
         <w:t xml:space="preserve">) : </w:t>
+      </w:r>
+      <w:r>
+        <w:rPr>
+          <w:rStyle w:val="SubtleReference"/>
+          <w:b/>
+          <w:bCs/>
+          <w:color w:val="00B0F0"/>
+          <w:sz w:val="24"/>
+          <w:szCs w:val="32"/>
+        </w:rPr>
+        <w:t>https://github.com/ManusiaIteraNo062/Tubes_GUNDAMKW</w:t>
       </w:r>
     </w:p>
     <w:p>

</xml_diff>